<commit_message>
Switch risk method to Exploitability x Severity (FDA-aligned) across template, docx, Q2, guide, prompts, slides
</commit_message>
<xml_diff>
--- a/templates/threat-model-template.docx
+++ b/templates/threat-model-template.docx
@@ -1421,16 +1421,18 @@
         <w:rPr>
           <w:b/>
         </w:rPr>
-        <w:t xml:space="preserve">Likelihood: </w:t>
+        <w:t xml:space="preserve">Exploitability: </w:t>
       </w:r>
       <w:r>
-        <w:t xml:space="preserve">1 = Hard · 2 = Realistic · 3 = Easy      </w:t>
+        <w:t>1 = Low (rare access / high skill) · 2 = Moderate (remote, known weakness) · 3 = High (trivial, public exploit)</w:t>
       </w:r>
+    </w:p>
+    <w:p>
       <w:r>
         <w:rPr>
           <w:b/>
         </w:rPr>
-        <w:t xml:space="preserve">Impact: </w:t>
+        <w:t xml:space="preserve">Severity of patient harm: </w:t>
       </w:r>
       <w:r>
         <w:t>1 = Minor · 2 = Significant · 3 = Serious</w:t>
@@ -1441,7 +1443,7 @@
         <w:rPr>
           <w:b/>
         </w:rPr>
-        <w:t>Risk = Likelihood × Impact  →  1–2: Low · 3–4: Medium · 6–9: High</w:t>
+        <w:t>Risk = Exploitability × Severity  →  1–2: Low · 3–4: Medium · 6–9: High</w:t>
       </w:r>
     </w:p>
     <w:p>
@@ -1459,7 +1461,7 @@
           <w:color w:val="555555"/>
           <w:sz w:val="20"/>
         </w:rPr>
-        <w:t>FDA note: real submissions reframe "Likelihood" as "Exploitability" (how feasible the attack is) — the FDA does not permit probabilistic scoring for security risk. We use Likelihood here for simplicity; the reasoning transfers.</w:t>
+        <w:t>FDA note: security risk is scored on exploitability (how feasible the attack is), not probability — the FDA does not permit probabilistic scoring for security risk. Exploitability × severity is the FDA's controlled/uncontrolled matrix.</w:t>
       </w:r>
     </w:p>
     <w:tbl>
@@ -1509,7 +1511,7 @@
                 <w:color w:val="FFFFFF"/>
                 <w:sz w:val="20"/>
               </w:rPr>
-              <w:t>Likelihood (1–3)</w:t>
+              <w:t>Exploitability (1–3)</w:t>
             </w:r>
           </w:p>
         </w:tc>
@@ -1543,7 +1545,7 @@
                 <w:color w:val="FFFFFF"/>
                 <w:sz w:val="20"/>
               </w:rPr>
-              <w:t>Impact (1–3)</w:t>
+              <w:t>Severity (1–3)</w:t>
             </w:r>
           </w:p>
         </w:tc>
@@ -2618,7 +2620,7 @@
     </w:p>
     <w:p>
       <w:r>
-        <w:t>☐  Every story has a likelihood, impact, and risk score</w:t>
+        <w:t>☐  Every story has an exploitability, severity, and risk score</w:t>
       </w:r>
     </w:p>
     <w:p>

</xml_diff>

<commit_message>
Broaden severity to cover privacy/availability harm; add S/P/A impact-type tag and STRIDE/CVSS real-engagement notes across template, docx, Q2, guide, prompt, slides
</commit_message>
<xml_diff>
--- a/templates/threat-model-template.docx
+++ b/templates/threat-model-template.docx
@@ -1057,15 +1057,16 @@
         <w:tblLook w:firstColumn="1" w:firstRow="1" w:lastColumn="0" w:lastRow="0" w:noHBand="0" w:noVBand="1" w:val="04A0"/>
       </w:tblPr>
       <w:tblGrid>
-        <w:gridCol w:w="2160"/>
-        <w:gridCol w:w="2160"/>
-        <w:gridCol w:w="2160"/>
-        <w:gridCol w:w="2160"/>
+        <w:gridCol w:w="1728"/>
+        <w:gridCol w:w="1728"/>
+        <w:gridCol w:w="1728"/>
+        <w:gridCol w:w="1728"/>
+        <w:gridCol w:w="1728"/>
       </w:tblGrid>
       <w:tr>
         <w:tc>
           <w:tcPr>
-            <w:tcW w:type="dxa" w:w="2160"/>
+            <w:tcW w:type="dxa" w:w="1728"/>
             <w:shd w:val="clear" w:color="auto" w:fill="1F497D"/>
           </w:tcPr>
           <w:p>
@@ -1082,7 +1083,7 @@
         </w:tc>
         <w:tc>
           <w:tcPr>
-            <w:tcW w:type="dxa" w:w="2160"/>
+            <w:tcW w:type="dxa" w:w="1728"/>
             <w:shd w:val="clear" w:color="auto" w:fill="1F497D"/>
           </w:tcPr>
           <w:p>
@@ -1099,7 +1100,7 @@
         </w:tc>
         <w:tc>
           <w:tcPr>
-            <w:tcW w:type="dxa" w:w="2160"/>
+            <w:tcW w:type="dxa" w:w="1728"/>
             <w:shd w:val="clear" w:color="auto" w:fill="1F497D"/>
           </w:tcPr>
           <w:p>
@@ -1116,7 +1117,7 @@
         </w:tc>
         <w:tc>
           <w:tcPr>
-            <w:tcW w:type="dxa" w:w="2160"/>
+            <w:tcW w:type="dxa" w:w="1728"/>
             <w:shd w:val="clear" w:color="auto" w:fill="1F497D"/>
           </w:tcPr>
           <w:p>
@@ -1131,11 +1132,28 @@
             </w:r>
           </w:p>
         </w:tc>
+        <w:tc>
+          <w:tcPr>
+            <w:tcW w:type="dxa" w:w="1728"/>
+            <w:shd w:val="clear" w:color="auto" w:fill="1F497D"/>
+          </w:tcPr>
+          <w:p>
+            <w:r/>
+            <w:r>
+              <w:rPr>
+                <w:b/>
+                <w:color w:val="FFFFFF"/>
+                <w:sz w:val="20"/>
+              </w:rPr>
+              <w:t>Impact type (S/P/A)</w:t>
+            </w:r>
+          </w:p>
+        </w:tc>
       </w:tr>
       <w:tr>
         <w:tc>
           <w:tcPr>
-            <w:tcW w:type="dxa" w:w="2160"/>
+            <w:tcW w:type="dxa" w:w="1728"/>
           </w:tcPr>
           <w:p>
             <w:r/>
@@ -1151,7 +1169,7 @@
         </w:tc>
         <w:tc>
           <w:tcPr>
-            <w:tcW w:type="dxa" w:w="2160"/>
+            <w:tcW w:type="dxa" w:w="1728"/>
           </w:tcPr>
           <w:p>
             <w:r/>
@@ -1167,7 +1185,7 @@
         </w:tc>
         <w:tc>
           <w:tcPr>
-            <w:tcW w:type="dxa" w:w="2160"/>
+            <w:tcW w:type="dxa" w:w="1728"/>
           </w:tcPr>
           <w:p>
             <w:r/>
@@ -1183,7 +1201,7 @@
         </w:tc>
         <w:tc>
           <w:tcPr>
-            <w:tcW w:type="dxa" w:w="2160"/>
+            <w:tcW w:type="dxa" w:w="1728"/>
           </w:tcPr>
           <w:p>
             <w:r/>
@@ -1197,29 +1215,51 @@
             </w:r>
           </w:p>
         </w:tc>
+        <w:tc>
+          <w:tcPr>
+            <w:tcW w:type="dxa" w:w="1728"/>
+          </w:tcPr>
+          <w:p>
+            <w:r/>
+            <w:r>
+              <w:rPr>
+                <w:i/>
+                <w:color w:val="555555"/>
+                <w:sz w:val="20"/>
+              </w:rPr>
+              <w:t>A</w:t>
+            </w:r>
+          </w:p>
+        </w:tc>
       </w:tr>
       <w:tr>
         <w:tc>
           <w:tcPr>
-            <w:tcW w:type="dxa" w:w="2160"/>
+            <w:tcW w:type="dxa" w:w="1728"/>
           </w:tcPr>
           <w:p/>
         </w:tc>
         <w:tc>
           <w:tcPr>
-            <w:tcW w:type="dxa" w:w="2160"/>
+            <w:tcW w:type="dxa" w:w="1728"/>
           </w:tcPr>
           <w:p/>
         </w:tc>
         <w:tc>
           <w:tcPr>
-            <w:tcW w:type="dxa" w:w="2160"/>
+            <w:tcW w:type="dxa" w:w="1728"/>
           </w:tcPr>
           <w:p/>
         </w:tc>
         <w:tc>
           <w:tcPr>
-            <w:tcW w:type="dxa" w:w="2160"/>
+            <w:tcW w:type="dxa" w:w="1728"/>
+          </w:tcPr>
+          <w:p/>
+        </w:tc>
+        <w:tc>
+          <w:tcPr>
+            <w:tcW w:type="dxa" w:w="1728"/>
           </w:tcPr>
           <w:p/>
         </w:tc>
@@ -1227,25 +1267,31 @@
       <w:tr>
         <w:tc>
           <w:tcPr>
-            <w:tcW w:type="dxa" w:w="2160"/>
+            <w:tcW w:type="dxa" w:w="1728"/>
           </w:tcPr>
           <w:p/>
         </w:tc>
         <w:tc>
           <w:tcPr>
-            <w:tcW w:type="dxa" w:w="2160"/>
+            <w:tcW w:type="dxa" w:w="1728"/>
           </w:tcPr>
           <w:p/>
         </w:tc>
         <w:tc>
           <w:tcPr>
-            <w:tcW w:type="dxa" w:w="2160"/>
+            <w:tcW w:type="dxa" w:w="1728"/>
           </w:tcPr>
           <w:p/>
         </w:tc>
         <w:tc>
           <w:tcPr>
-            <w:tcW w:type="dxa" w:w="2160"/>
+            <w:tcW w:type="dxa" w:w="1728"/>
+          </w:tcPr>
+          <w:p/>
+        </w:tc>
+        <w:tc>
+          <w:tcPr>
+            <w:tcW w:type="dxa" w:w="1728"/>
           </w:tcPr>
           <w:p/>
         </w:tc>
@@ -1253,25 +1299,31 @@
       <w:tr>
         <w:tc>
           <w:tcPr>
-            <w:tcW w:type="dxa" w:w="2160"/>
+            <w:tcW w:type="dxa" w:w="1728"/>
           </w:tcPr>
           <w:p/>
         </w:tc>
         <w:tc>
           <w:tcPr>
-            <w:tcW w:type="dxa" w:w="2160"/>
+            <w:tcW w:type="dxa" w:w="1728"/>
           </w:tcPr>
           <w:p/>
         </w:tc>
         <w:tc>
           <w:tcPr>
-            <w:tcW w:type="dxa" w:w="2160"/>
+            <w:tcW w:type="dxa" w:w="1728"/>
           </w:tcPr>
           <w:p/>
         </w:tc>
         <w:tc>
           <w:tcPr>
-            <w:tcW w:type="dxa" w:w="2160"/>
+            <w:tcW w:type="dxa" w:w="1728"/>
+          </w:tcPr>
+          <w:p/>
+        </w:tc>
+        <w:tc>
+          <w:tcPr>
+            <w:tcW w:type="dxa" w:w="1728"/>
           </w:tcPr>
           <w:p/>
         </w:tc>
@@ -1279,25 +1331,31 @@
       <w:tr>
         <w:tc>
           <w:tcPr>
-            <w:tcW w:type="dxa" w:w="2160"/>
+            <w:tcW w:type="dxa" w:w="1728"/>
           </w:tcPr>
           <w:p/>
         </w:tc>
         <w:tc>
           <w:tcPr>
-            <w:tcW w:type="dxa" w:w="2160"/>
+            <w:tcW w:type="dxa" w:w="1728"/>
           </w:tcPr>
           <w:p/>
         </w:tc>
         <w:tc>
           <w:tcPr>
-            <w:tcW w:type="dxa" w:w="2160"/>
+            <w:tcW w:type="dxa" w:w="1728"/>
           </w:tcPr>
           <w:p/>
         </w:tc>
         <w:tc>
           <w:tcPr>
-            <w:tcW w:type="dxa" w:w="2160"/>
+            <w:tcW w:type="dxa" w:w="1728"/>
+          </w:tcPr>
+          <w:p/>
+        </w:tc>
+        <w:tc>
+          <w:tcPr>
+            <w:tcW w:type="dxa" w:w="1728"/>
           </w:tcPr>
           <w:p/>
         </w:tc>
@@ -1305,25 +1363,31 @@
       <w:tr>
         <w:tc>
           <w:tcPr>
-            <w:tcW w:type="dxa" w:w="2160"/>
+            <w:tcW w:type="dxa" w:w="1728"/>
           </w:tcPr>
           <w:p/>
         </w:tc>
         <w:tc>
           <w:tcPr>
-            <w:tcW w:type="dxa" w:w="2160"/>
+            <w:tcW w:type="dxa" w:w="1728"/>
           </w:tcPr>
           <w:p/>
         </w:tc>
         <w:tc>
           <w:tcPr>
-            <w:tcW w:type="dxa" w:w="2160"/>
+            <w:tcW w:type="dxa" w:w="1728"/>
           </w:tcPr>
           <w:p/>
         </w:tc>
         <w:tc>
           <w:tcPr>
-            <w:tcW w:type="dxa" w:w="2160"/>
+            <w:tcW w:type="dxa" w:w="1728"/>
+          </w:tcPr>
+          <w:p/>
+        </w:tc>
+        <w:tc>
+          <w:tcPr>
+            <w:tcW w:type="dxa" w:w="1728"/>
           </w:tcPr>
           <w:p/>
         </w:tc>
@@ -1331,25 +1395,31 @@
       <w:tr>
         <w:tc>
           <w:tcPr>
-            <w:tcW w:type="dxa" w:w="2160"/>
+            <w:tcW w:type="dxa" w:w="1728"/>
           </w:tcPr>
           <w:p/>
         </w:tc>
         <w:tc>
           <w:tcPr>
-            <w:tcW w:type="dxa" w:w="2160"/>
+            <w:tcW w:type="dxa" w:w="1728"/>
           </w:tcPr>
           <w:p/>
         </w:tc>
         <w:tc>
           <w:tcPr>
-            <w:tcW w:type="dxa" w:w="2160"/>
+            <w:tcW w:type="dxa" w:w="1728"/>
           </w:tcPr>
           <w:p/>
         </w:tc>
         <w:tc>
           <w:tcPr>
-            <w:tcW w:type="dxa" w:w="2160"/>
+            <w:tcW w:type="dxa" w:w="1728"/>
+          </w:tcPr>
+          <w:p/>
+        </w:tc>
+        <w:tc>
+          <w:tcPr>
+            <w:tcW w:type="dxa" w:w="1728"/>
           </w:tcPr>
           <w:p/>
         </w:tc>
@@ -1357,25 +1427,31 @@
       <w:tr>
         <w:tc>
           <w:tcPr>
-            <w:tcW w:type="dxa" w:w="2160"/>
+            <w:tcW w:type="dxa" w:w="1728"/>
           </w:tcPr>
           <w:p/>
         </w:tc>
         <w:tc>
           <w:tcPr>
-            <w:tcW w:type="dxa" w:w="2160"/>
+            <w:tcW w:type="dxa" w:w="1728"/>
           </w:tcPr>
           <w:p/>
         </w:tc>
         <w:tc>
           <w:tcPr>
-            <w:tcW w:type="dxa" w:w="2160"/>
+            <w:tcW w:type="dxa" w:w="1728"/>
           </w:tcPr>
           <w:p/>
         </w:tc>
         <w:tc>
           <w:tcPr>
-            <w:tcW w:type="dxa" w:w="2160"/>
+            <w:tcW w:type="dxa" w:w="1728"/>
+          </w:tcPr>
+          <w:p/>
+        </w:tc>
+        <w:tc>
+          <w:tcPr>
+            <w:tcW w:type="dxa" w:w="1728"/>
           </w:tcPr>
           <w:p/>
         </w:tc>
@@ -1383,31 +1459,47 @@
       <w:tr>
         <w:tc>
           <w:tcPr>
-            <w:tcW w:type="dxa" w:w="2160"/>
+            <w:tcW w:type="dxa" w:w="1728"/>
           </w:tcPr>
           <w:p/>
         </w:tc>
         <w:tc>
           <w:tcPr>
-            <w:tcW w:type="dxa" w:w="2160"/>
+            <w:tcW w:type="dxa" w:w="1728"/>
           </w:tcPr>
           <w:p/>
         </w:tc>
         <w:tc>
           <w:tcPr>
-            <w:tcW w:type="dxa" w:w="2160"/>
+            <w:tcW w:type="dxa" w:w="1728"/>
           </w:tcPr>
           <w:p/>
         </w:tc>
         <w:tc>
           <w:tcPr>
-            <w:tcW w:type="dxa" w:w="2160"/>
+            <w:tcW w:type="dxa" w:w="1728"/>
+          </w:tcPr>
+          <w:p/>
+        </w:tc>
+        <w:tc>
+          <w:tcPr>
+            <w:tcW w:type="dxa" w:w="1728"/>
           </w:tcPr>
           <w:p/>
         </w:tc>
       </w:tr>
     </w:tbl>
     <w:p/>
+    <w:p>
+      <w:r>
+        <w:rPr>
+          <w:i/>
+          <w:color w:val="555555"/>
+          <w:sz w:val="20"/>
+        </w:rPr>
+        <w:t>Impact type: S = patient safety (physical harm) · P = privacy / PHI (confidentiality) · A = availability (loss of scanning / care disruption). Tag the dominant type — it tells you which harm to score in 2.2. A threat can carry more than one.</w:t>
+      </w:r>
+    </w:p>
     <w:p>
       <w:pPr>
         <w:pStyle w:val="Heading3"/>
@@ -1432,10 +1524,10 @@
         <w:rPr>
           <w:b/>
         </w:rPr>
-        <w:t xml:space="preserve">Severity of patient harm: </w:t>
+        <w:t xml:space="preserve">Severity of harm (patient safety first — also privacy &amp; availability): </w:t>
       </w:r>
       <w:r>
-        <w:t>1 = Minor · 2 = Significant · 3 = Serious</w:t>
+        <w:t>1 = Minor (no patient harm; negligible privacy/operational impact) · 2 = Significant (care delayed/degraded, a privacy/PHI breach, or meaningful downtime) · 3 = Serious (direct patient harm, a large-scale PHI breach, or extended loss of scanning)</w:t>
       </w:r>
     </w:p>
     <w:p>
@@ -1451,7 +1543,7 @@
         <w:rPr>
           <w:b/>
         </w:rPr>
-        <w:t>Patient safety rule: if a story could directly harm a patient, mark it High regardless of score and add a note.</w:t>
+        <w:t>Patient safety rule: if a story could directly harm a patient, mark it High regardless of score and add a note. Score a confidentiality-only threat on the severity of its privacy harm — not "no harm".</w:t>
       </w:r>
     </w:p>
     <w:p>
@@ -1462,6 +1554,16 @@
           <w:sz w:val="20"/>
         </w:rPr>
         <w:t>FDA note: security risk is scored on exploitability (how feasible the attack is), not probability — the FDA does not permit probabilistic scoring for security risk. Exploitability × severity is the FDA's controlled/uncontrolled matrix.</w:t>
+      </w:r>
+    </w:p>
+    <w:p>
+      <w:r>
+        <w:rPr>
+          <w:i/>
+          <w:color w:val="555555"/>
+          <w:sz w:val="20"/>
+        </w:rPr>
+        <w:t>In a real engagement: this 3×3 is a teaching scale. Production threat models usually layer STRIDE (systematic enumeration per component/data flow) and CVSS (standardized exploitability scoring) on top — noting base CVSS doesn't capture patient-safety severity, so it's adapted with a medical-device rubric, not used raw.</w:t>
       </w:r>
     </w:p>
     <w:tbl>

</xml_diff>

<commit_message>
Combine intro and product architecture into the generated worksheet docx
The generated participant .docx now contains three page-break-separated
sections that read like tabs: Introduction (why threat model medical
devices), Product & Architecture (the NeuroScan 3000 scenario), and the
fillable Q1-Q4 worksheet. Teams get context, the product, and the
worksheet in one file instead of cross-referencing separate documents.

Real Google Docs tabs cannot be embedded via .docx import, so the
portable equivalent is Heading 1 sections plus page breaks; SKILL.md
documents the optional manual step to split them into tabs after upload.

Co-authored-by: Ona <no-reply@ona.com>
</commit_message>
<xml_diff>
--- a/templates/threat-model-template.docx
+++ b/templates/threat-model-template.docx
@@ -7,7 +7,2655 @@
         <w:pStyle w:val="Heading1"/>
       </w:pPr>
       <w:r>
-        <w:t>Threat Model — NeuroScan 3000</w:t>
+        <w:t>Introduction — Why Threat Model Medical Devices?</w:t>
+      </w:r>
+    </w:p>
+    <w:p>
+      <w:pPr>
+        <w:pStyle w:val="Heading2"/>
+      </w:pPr>
+      <w:r>
+        <w:t>What is threat modeling?</w:t>
+      </w:r>
+    </w:p>
+    <w:p>
+      <w:r>
+        <w:t>Threat modeling is a structured process for identifying security and safety threats to a system, assessing their risk, and designing countermeasures — before an attacker does it for you.</w:t>
+      </w:r>
+    </w:p>
+    <w:p>
+      <w:r>
+        <w:t>At its core it answers four questions:</w:t>
+      </w:r>
+    </w:p>
+    <w:p>
+      <w:pPr>
+        <w:pStyle w:val="ListNumber"/>
+      </w:pPr>
+      <w:r>
+        <w:t>What are we working on? — system decomposition and scoping</w:t>
+      </w:r>
+    </w:p>
+    <w:p>
+      <w:pPr>
+        <w:pStyle w:val="ListNumber"/>
+      </w:pPr>
+      <w:r>
+        <w:t>What can go wrong? — threat identification and risk assessment</w:t>
+      </w:r>
+    </w:p>
+    <w:p>
+      <w:pPr>
+        <w:pStyle w:val="ListNumber"/>
+      </w:pPr>
+      <w:r>
+        <w:t>What are we going to do about it? — mitigations and controls</w:t>
+      </w:r>
+    </w:p>
+    <w:p>
+      <w:pPr>
+        <w:pStyle w:val="ListNumber"/>
+      </w:pPr>
+      <w:r>
+        <w:t>Did we do a good job? — validation and review</w:t>
+      </w:r>
+    </w:p>
+    <w:p>
+      <w:pPr>
+        <w:pStyle w:val="Heading2"/>
+      </w:pPr>
+      <w:r>
+        <w:t>Why does it matter for medical devices?</w:t>
+      </w:r>
+    </w:p>
+    <w:p>
+      <w:r>
+        <w:t>Medical devices are increasingly software-defined and network-connected. This creates new attack surfaces that didn't exist a decade ago.</w:t>
+      </w:r>
+    </w:p>
+    <w:p>
+      <w:r>
+        <w:rPr>
+          <w:b/>
+        </w:rPr>
+        <w:t>The stakes are uniquely high:</w:t>
+      </w:r>
+    </w:p>
+    <w:p>
+      <w:pPr>
+        <w:pStyle w:val="ListBullet"/>
+      </w:pPr>
+      <w:r>
+        <w:t>A compromised device can directly harm patients (wrong diagnosis, wrong therapy)</w:t>
+      </w:r>
+    </w:p>
+    <w:p>
+      <w:pPr>
+        <w:pStyle w:val="ListBullet"/>
+      </w:pPr>
+      <w:r>
+        <w:t>Medical records are among the most valuable data on the black market</w:t>
+      </w:r>
+    </w:p>
+    <w:p>
+      <w:pPr>
+        <w:pStyle w:val="ListBullet"/>
+      </w:pPr>
+      <w:r>
+        <w:t>Ransomware attacks on hospitals have demonstrably delayed care and caused patient harm</w:t>
+      </w:r>
+    </w:p>
+    <w:p>
+      <w:pPr>
+        <w:pStyle w:val="ListBullet"/>
+      </w:pPr>
+      <w:r>
+        <w:t>Regulatory bodies (FDA, EU MDR) now require cybersecurity documentation as part of premarket submissions</w:t>
+      </w:r>
+    </w:p>
+    <w:p>
+      <w:r>
+        <w:rPr>
+          <w:b/>
+        </w:rPr>
+        <w:t>Real-world context:</w:t>
+      </w:r>
+    </w:p>
+    <w:p>
+      <w:pPr>
+        <w:pStyle w:val="ListBullet"/>
+      </w:pPr>
+      <w:r>
+        <w:t>The FDA's 2023 guidance on cybersecurity in medical devices requires manufacturers to submit a threat model as part of the 510(k) / PMA process</w:t>
+      </w:r>
+    </w:p>
+    <w:p>
+      <w:pPr>
+        <w:pStyle w:val="ListBullet"/>
+      </w:pPr>
+      <w:r>
+        <w:t>MITRE's Playbook (2021) provides a structured framework specifically for medical devices</w:t>
+      </w:r>
+    </w:p>
+    <w:p>
+      <w:pPr>
+        <w:pStyle w:val="ListBullet"/>
+      </w:pPr>
+      <w:r>
+        <w:t>ICS-CERT and CISA regularly publish advisories on vulnerabilities in medical device software</w:t>
+      </w:r>
+    </w:p>
+    <w:p>
+      <w:pPr>
+        <w:pStyle w:val="Heading2"/>
+      </w:pPr>
+      <w:r>
+        <w:t>The MITRE Medical Device Threat Modeling Playbook</w:t>
+      </w:r>
+    </w:p>
+    <w:p>
+      <w:r>
+        <w:t>This workshop is based on the MITRE Playbook for Threat Modeling Medical Devices. The playbook is structured around four questions:</w:t>
+      </w:r>
+    </w:p>
+    <w:tbl>
+      <w:tblPr>
+        <w:tblStyle w:val="TableGrid"/>
+        <w:tblW w:type="auto" w:w="0"/>
+        <w:tblLook w:firstColumn="1" w:firstRow="1" w:lastColumn="0" w:lastRow="0" w:noHBand="0" w:noVBand="1" w:val="04A0"/>
+      </w:tblPr>
+      <w:tblGrid>
+        <w:gridCol w:w="4320"/>
+        <w:gridCol w:w="4320"/>
+      </w:tblGrid>
+      <w:tr>
+        <w:tc>
+          <w:tcPr>
+            <w:tcW w:type="dxa" w:w="4320"/>
+            <w:shd w:val="clear" w:color="auto" w:fill="1F497D"/>
+          </w:tcPr>
+          <w:p>
+            <w:r/>
+            <w:r>
+              <w:rPr>
+                <w:b/>
+                <w:color w:val="FFFFFF"/>
+                <w:sz w:val="20"/>
+              </w:rPr>
+              <w:t>Question</w:t>
+            </w:r>
+          </w:p>
+        </w:tc>
+        <w:tc>
+          <w:tcPr>
+            <w:tcW w:type="dxa" w:w="4320"/>
+            <w:shd w:val="clear" w:color="auto" w:fill="1F497D"/>
+          </w:tcPr>
+          <w:p>
+            <w:r/>
+            <w:r>
+              <w:rPr>
+                <w:b/>
+                <w:color w:val="FFFFFF"/>
+                <w:sz w:val="20"/>
+              </w:rPr>
+              <w:t>Activity</w:t>
+            </w:r>
+          </w:p>
+        </w:tc>
+      </w:tr>
+      <w:tr>
+        <w:tc>
+          <w:tcPr>
+            <w:tcW w:type="dxa" w:w="4320"/>
+          </w:tcPr>
+          <w:p>
+            <w:r/>
+            <w:r>
+              <w:rPr>
+                <w:sz w:val="20"/>
+              </w:rPr>
+              <w:t>Q1</w:t>
+            </w:r>
+          </w:p>
+        </w:tc>
+        <w:tc>
+          <w:tcPr>
+            <w:tcW w:type="dxa" w:w="4320"/>
+          </w:tcPr>
+          <w:p>
+            <w:r/>
+            <w:r>
+              <w:rPr>
+                <w:sz w:val="20"/>
+              </w:rPr>
+              <w:t>What are we working on? — scope the system, identify assets, entry points, and actors</w:t>
+            </w:r>
+          </w:p>
+        </w:tc>
+      </w:tr>
+      <w:tr>
+        <w:tc>
+          <w:tcPr>
+            <w:tcW w:type="dxa" w:w="4320"/>
+          </w:tcPr>
+          <w:p>
+            <w:r/>
+            <w:r>
+              <w:rPr>
+                <w:sz w:val="20"/>
+              </w:rPr>
+              <w:t>Q2</w:t>
+            </w:r>
+          </w:p>
+        </w:tc>
+        <w:tc>
+          <w:tcPr>
+            <w:tcW w:type="dxa" w:w="4320"/>
+          </w:tcPr>
+          <w:p>
+            <w:r/>
+            <w:r>
+              <w:rPr>
+                <w:sz w:val="20"/>
+              </w:rPr>
+              <w:t>What can go wrong? — identify threats (STRIDE, ATT&amp;CK) and assess their risk</w:t>
+            </w:r>
+          </w:p>
+        </w:tc>
+      </w:tr>
+      <w:tr>
+        <w:tc>
+          <w:tcPr>
+            <w:tcW w:type="dxa" w:w="4320"/>
+          </w:tcPr>
+          <w:p>
+            <w:r/>
+            <w:r>
+              <w:rPr>
+                <w:sz w:val="20"/>
+              </w:rPr>
+              <w:t>Q3</w:t>
+            </w:r>
+          </w:p>
+        </w:tc>
+        <w:tc>
+          <w:tcPr>
+            <w:tcW w:type="dxa" w:w="4320"/>
+          </w:tcPr>
+          <w:p>
+            <w:r/>
+            <w:r>
+              <w:rPr>
+                <w:sz w:val="20"/>
+              </w:rPr>
+              <w:t>What are we going to do about it? — define mitigations and controls</w:t>
+            </w:r>
+          </w:p>
+        </w:tc>
+      </w:tr>
+      <w:tr>
+        <w:tc>
+          <w:tcPr>
+            <w:tcW w:type="dxa" w:w="4320"/>
+          </w:tcPr>
+          <w:p>
+            <w:r/>
+            <w:r>
+              <w:rPr>
+                <w:sz w:val="20"/>
+              </w:rPr>
+              <w:t>Q4</w:t>
+            </w:r>
+          </w:p>
+        </w:tc>
+        <w:tc>
+          <w:tcPr>
+            <w:tcW w:type="dxa" w:w="4320"/>
+          </w:tcPr>
+          <w:p>
+            <w:r/>
+            <w:r>
+              <w:rPr>
+                <w:sz w:val="20"/>
+              </w:rPr>
+              <w:t>Did we do a good job? — validate completeness, document, and review</w:t>
+            </w:r>
+          </w:p>
+        </w:tc>
+      </w:tr>
+    </w:tbl>
+    <w:p/>
+    <w:p>
+      <w:pPr>
+        <w:pStyle w:val="Heading2"/>
+      </w:pPr>
+      <w:r>
+        <w:t>What makes medical device threat modeling different?</w:t>
+      </w:r>
+    </w:p>
+    <w:tbl>
+      <w:tblPr>
+        <w:tblStyle w:val="TableGrid"/>
+        <w:tblW w:type="auto" w:w="0"/>
+        <w:tblLook w:firstColumn="1" w:firstRow="1" w:lastColumn="0" w:lastRow="0" w:noHBand="0" w:noVBand="1" w:val="04A0"/>
+      </w:tblPr>
+      <w:tblGrid>
+        <w:gridCol w:w="2880"/>
+        <w:gridCol w:w="2880"/>
+        <w:gridCol w:w="2880"/>
+      </w:tblGrid>
+      <w:tr>
+        <w:tc>
+          <w:tcPr>
+            <w:tcW w:type="dxa" w:w="2880"/>
+            <w:shd w:val="clear" w:color="auto" w:fill="1F497D"/>
+          </w:tcPr>
+          <w:p>
+            <w:r/>
+            <w:r>
+              <w:rPr>
+                <w:b/>
+                <w:color w:val="FFFFFF"/>
+                <w:sz w:val="20"/>
+              </w:rPr>
+              <w:t>Aspect</w:t>
+            </w:r>
+          </w:p>
+        </w:tc>
+        <w:tc>
+          <w:tcPr>
+            <w:tcW w:type="dxa" w:w="2880"/>
+            <w:shd w:val="clear" w:color="auto" w:fill="1F497D"/>
+          </w:tcPr>
+          <w:p>
+            <w:r/>
+            <w:r>
+              <w:rPr>
+                <w:b/>
+                <w:color w:val="FFFFFF"/>
+                <w:sz w:val="20"/>
+              </w:rPr>
+              <w:t>General IT</w:t>
+            </w:r>
+          </w:p>
+        </w:tc>
+        <w:tc>
+          <w:tcPr>
+            <w:tcW w:type="dxa" w:w="2880"/>
+            <w:shd w:val="clear" w:color="auto" w:fill="1F497D"/>
+          </w:tcPr>
+          <w:p>
+            <w:r/>
+            <w:r>
+              <w:rPr>
+                <w:b/>
+                <w:color w:val="FFFFFF"/>
+                <w:sz w:val="20"/>
+              </w:rPr>
+              <w:t>Medical Devices</w:t>
+            </w:r>
+          </w:p>
+        </w:tc>
+      </w:tr>
+      <w:tr>
+        <w:tc>
+          <w:tcPr>
+            <w:tcW w:type="dxa" w:w="2880"/>
+          </w:tcPr>
+          <w:p>
+            <w:r/>
+            <w:r>
+              <w:rPr>
+                <w:sz w:val="20"/>
+              </w:rPr>
+              <w:t>Primary risk</w:t>
+            </w:r>
+          </w:p>
+        </w:tc>
+        <w:tc>
+          <w:tcPr>
+            <w:tcW w:type="dxa" w:w="2880"/>
+          </w:tcPr>
+          <w:p>
+            <w:r/>
+            <w:r>
+              <w:rPr>
+                <w:sz w:val="20"/>
+              </w:rPr>
+              <w:t>Data breach, service disruption</w:t>
+            </w:r>
+          </w:p>
+        </w:tc>
+        <w:tc>
+          <w:tcPr>
+            <w:tcW w:type="dxa" w:w="2880"/>
+          </w:tcPr>
+          <w:p>
+            <w:r/>
+            <w:r>
+              <w:rPr>
+                <w:sz w:val="20"/>
+              </w:rPr>
+              <w:t>Patient harm, misdiagnosis</w:t>
+            </w:r>
+          </w:p>
+        </w:tc>
+      </w:tr>
+      <w:tr>
+        <w:tc>
+          <w:tcPr>
+            <w:tcW w:type="dxa" w:w="2880"/>
+          </w:tcPr>
+          <w:p>
+            <w:r/>
+            <w:r>
+              <w:rPr>
+                <w:sz w:val="20"/>
+              </w:rPr>
+              <w:t>Availability</w:t>
+            </w:r>
+          </w:p>
+        </w:tc>
+        <w:tc>
+          <w:tcPr>
+            <w:tcW w:type="dxa" w:w="2880"/>
+          </w:tcPr>
+          <w:p>
+            <w:r/>
+            <w:r>
+              <w:rPr>
+                <w:sz w:val="20"/>
+              </w:rPr>
+              <w:t>Important</w:t>
+            </w:r>
+          </w:p>
+        </w:tc>
+        <w:tc>
+          <w:tcPr>
+            <w:tcW w:type="dxa" w:w="2880"/>
+          </w:tcPr>
+          <w:p>
+            <w:r/>
+            <w:r>
+              <w:rPr>
+                <w:sz w:val="20"/>
+              </w:rPr>
+              <w:t>Often life-critical</w:t>
+            </w:r>
+          </w:p>
+        </w:tc>
+      </w:tr>
+      <w:tr>
+        <w:tc>
+          <w:tcPr>
+            <w:tcW w:type="dxa" w:w="2880"/>
+          </w:tcPr>
+          <w:p>
+            <w:r/>
+            <w:r>
+              <w:rPr>
+                <w:sz w:val="20"/>
+              </w:rPr>
+              <w:t>Patching cadence</w:t>
+            </w:r>
+          </w:p>
+        </w:tc>
+        <w:tc>
+          <w:tcPr>
+            <w:tcW w:type="dxa" w:w="2880"/>
+          </w:tcPr>
+          <w:p>
+            <w:r/>
+            <w:r>
+              <w:rPr>
+                <w:sz w:val="20"/>
+              </w:rPr>
+              <w:t>Weekly/monthly</w:t>
+            </w:r>
+          </w:p>
+        </w:tc>
+        <w:tc>
+          <w:tcPr>
+            <w:tcW w:type="dxa" w:w="2880"/>
+          </w:tcPr>
+          <w:p>
+            <w:r/>
+            <w:r>
+              <w:rPr>
+                <w:sz w:val="20"/>
+              </w:rPr>
+              <w:t>12–18 months (FDA clearance required)</w:t>
+            </w:r>
+          </w:p>
+        </w:tc>
+      </w:tr>
+      <w:tr>
+        <w:tc>
+          <w:tcPr>
+            <w:tcW w:type="dxa" w:w="2880"/>
+          </w:tcPr>
+          <w:p>
+            <w:r/>
+            <w:r>
+              <w:rPr>
+                <w:sz w:val="20"/>
+              </w:rPr>
+              <w:t>Regulatory context</w:t>
+            </w:r>
+          </w:p>
+        </w:tc>
+        <w:tc>
+          <w:tcPr>
+            <w:tcW w:type="dxa" w:w="2880"/>
+          </w:tcPr>
+          <w:p>
+            <w:r/>
+            <w:r>
+              <w:rPr>
+                <w:sz w:val="20"/>
+              </w:rPr>
+              <w:t>GDPR, CCPA</w:t>
+            </w:r>
+          </w:p>
+        </w:tc>
+        <w:tc>
+          <w:tcPr>
+            <w:tcW w:type="dxa" w:w="2880"/>
+          </w:tcPr>
+          <w:p>
+            <w:r/>
+            <w:r>
+              <w:rPr>
+                <w:sz w:val="20"/>
+              </w:rPr>
+              <w:t>FDA, EU MDR, IEC 62443, IEC 81001-5-1</w:t>
+            </w:r>
+          </w:p>
+        </w:tc>
+      </w:tr>
+      <w:tr>
+        <w:tc>
+          <w:tcPr>
+            <w:tcW w:type="dxa" w:w="2880"/>
+          </w:tcPr>
+          <w:p>
+            <w:r/>
+            <w:r>
+              <w:rPr>
+                <w:sz w:val="20"/>
+              </w:rPr>
+              <w:t>Threat actors</w:t>
+            </w:r>
+          </w:p>
+        </w:tc>
+        <w:tc>
+          <w:tcPr>
+            <w:tcW w:type="dxa" w:w="2880"/>
+          </w:tcPr>
+          <w:p>
+            <w:r/>
+            <w:r>
+              <w:rPr>
+                <w:sz w:val="20"/>
+              </w:rPr>
+              <w:t>Opportunistic attackers</w:t>
+            </w:r>
+          </w:p>
+        </w:tc>
+        <w:tc>
+          <w:tcPr>
+            <w:tcW w:type="dxa" w:w="2880"/>
+          </w:tcPr>
+          <w:p>
+            <w:r/>
+            <w:r>
+              <w:rPr>
+                <w:sz w:val="20"/>
+              </w:rPr>
+              <w:t>Includes nation-states targeting healthcare</w:t>
+            </w:r>
+          </w:p>
+        </w:tc>
+      </w:tr>
+      <w:tr>
+        <w:tc>
+          <w:tcPr>
+            <w:tcW w:type="dxa" w:w="2880"/>
+          </w:tcPr>
+          <w:p>
+            <w:r/>
+            <w:r>
+              <w:rPr>
+                <w:sz w:val="20"/>
+              </w:rPr>
+              <w:t>Supply chain</w:t>
+            </w:r>
+          </w:p>
+        </w:tc>
+        <w:tc>
+          <w:tcPr>
+            <w:tcW w:type="dxa" w:w="2880"/>
+          </w:tcPr>
+          <w:p>
+            <w:r/>
+            <w:r>
+              <w:rPr>
+                <w:sz w:val="20"/>
+              </w:rPr>
+              <w:t>Standard IT</w:t>
+            </w:r>
+          </w:p>
+        </w:tc>
+        <w:tc>
+          <w:tcPr>
+            <w:tcW w:type="dxa" w:w="2880"/>
+          </w:tcPr>
+          <w:p>
+            <w:r/>
+            <w:r>
+              <w:rPr>
+                <w:sz w:val="20"/>
+              </w:rPr>
+              <w:t>Proprietary protocols, COTS components in regulated systems</w:t>
+            </w:r>
+          </w:p>
+        </w:tc>
+      </w:tr>
+    </w:tbl>
+    <w:p/>
+    <w:p>
+      <w:pPr>
+        <w:pStyle w:val="Heading2"/>
+      </w:pPr>
+      <w:r>
+        <w:t>Today's scenario</w:t>
+      </w:r>
+    </w:p>
+    <w:p>
+      <w:r>
+        <w:t>You will threat model the NeuroScan 3000 — a hybrid MRI-based neurological imaging system. The next section (Product &amp; Architecture) describes it. Read it before you start Q1, then fill in the Threat Model Worksheet section by section as you work through Q1–Q4.</w:t>
+      </w:r>
+    </w:p>
+    <w:p>
+      <w:r>
+        <w:br w:type="page"/>
+      </w:r>
+    </w:p>
+    <w:p>
+      <w:pPr>
+        <w:pStyle w:val="Heading1"/>
+      </w:pPr>
+      <w:r>
+        <w:t>Product &amp; Architecture — NeuroScan 3000</w:t>
+      </w:r>
+    </w:p>
+    <w:p>
+      <w:r>
+        <w:rPr>
+          <w:i/>
+          <w:color w:val="555555"/>
+          <w:sz w:val="20"/>
+        </w:rPr>
+        <w:t>This is a fictional device created for training purposes. Any resemblance to real products is coincidental.</w:t>
+      </w:r>
+    </w:p>
+    <w:p>
+      <w:pPr>
+        <w:pStyle w:val="Heading2"/>
+      </w:pPr>
+      <w:r>
+        <w:t>Overview</w:t>
+      </w:r>
+    </w:p>
+    <w:p>
+      <w:r>
+        <w:t>NeuroScan 3000 is a neurological imaging system manufactured by MediScanTech Inc. It combines MRI-guided imaging with AI-assisted diagnostics to help clinicians detect neurological conditions such as stroke, tumours, and MS lesions.</w:t>
+      </w:r>
+    </w:p>
+    <w:p>
+      <w:r>
+        <w:t>The system is hybrid: it has hardware on-premise in the hospital, and a cloud platform operated by MediScanTech that provides AI analysis and software updates. Both parts are essential to its operation.</w:t>
+      </w:r>
+    </w:p>
+    <w:p>
+      <w:pPr>
+        <w:pStyle w:val="Heading2"/>
+      </w:pPr>
+      <w:r>
+        <w:t>Intended use</w:t>
+      </w:r>
+    </w:p>
+    <w:p>
+      <w:pPr>
+        <w:pStyle w:val="ListBullet"/>
+      </w:pPr>
+      <w:r>
+        <w:t>Clinical setting: radiology departments in hospitals</w:t>
+      </w:r>
+    </w:p>
+    <w:p>
+      <w:pPr>
+        <w:pStyle w:val="ListBullet"/>
+      </w:pPr>
+      <w:r>
+        <w:t>Primary users: radiologists, biomedical engineers, IT administrators</w:t>
+      </w:r>
+    </w:p>
+    <w:p>
+      <w:pPr>
+        <w:pStyle w:val="ListBullet"/>
+      </w:pPr>
+      <w:r>
+        <w:t>Regulatory classification: Class II medical device (EU MDR Class IIb, FDA 510(k))</w:t>
+      </w:r>
+    </w:p>
+    <w:p>
+      <w:pPr>
+        <w:pStyle w:val="Heading2"/>
+      </w:pPr>
+      <w:r>
+        <w:t>System components</w:t>
+      </w:r>
+    </w:p>
+    <w:p>
+      <w:pPr>
+        <w:pStyle w:val="Heading3"/>
+      </w:pPr>
+      <w:r>
+        <w:t>On-premise (hospital)</w:t>
+      </w:r>
+    </w:p>
+    <w:tbl>
+      <w:tblPr>
+        <w:tblStyle w:val="TableGrid"/>
+        <w:tblW w:type="auto" w:w="0"/>
+        <w:tblLook w:firstColumn="1" w:firstRow="1" w:lastColumn="0" w:lastRow="0" w:noHBand="0" w:noVBand="1" w:val="04A0"/>
+      </w:tblPr>
+      <w:tblGrid>
+        <w:gridCol w:w="4320"/>
+        <w:gridCol w:w="4320"/>
+      </w:tblGrid>
+      <w:tr>
+        <w:tc>
+          <w:tcPr>
+            <w:tcW w:type="dxa" w:w="4320"/>
+            <w:shd w:val="clear" w:color="auto" w:fill="1F497D"/>
+          </w:tcPr>
+          <w:p>
+            <w:r/>
+            <w:r>
+              <w:rPr>
+                <w:b/>
+                <w:color w:val="FFFFFF"/>
+                <w:sz w:val="20"/>
+              </w:rPr>
+              <w:t>Component</w:t>
+            </w:r>
+          </w:p>
+        </w:tc>
+        <w:tc>
+          <w:tcPr>
+            <w:tcW w:type="dxa" w:w="4320"/>
+            <w:shd w:val="clear" w:color="auto" w:fill="1F497D"/>
+          </w:tcPr>
+          <w:p>
+            <w:r/>
+            <w:r>
+              <w:rPr>
+                <w:b/>
+                <w:color w:val="FFFFFF"/>
+                <w:sz w:val="20"/>
+              </w:rPr>
+              <w:t>Description</w:t>
+            </w:r>
+          </w:p>
+        </w:tc>
+      </w:tr>
+      <w:tr>
+        <w:tc>
+          <w:tcPr>
+            <w:tcW w:type="dxa" w:w="4320"/>
+          </w:tcPr>
+          <w:p>
+            <w:r/>
+            <w:r>
+              <w:rPr>
+                <w:sz w:val="20"/>
+              </w:rPr>
+              <w:t>Imaging unit</w:t>
+            </w:r>
+          </w:p>
+        </w:tc>
+        <w:tc>
+          <w:tcPr>
+            <w:tcW w:type="dxa" w:w="4320"/>
+          </w:tcPr>
+          <w:p>
+            <w:r/>
+            <w:r>
+              <w:rPr>
+                <w:sz w:val="20"/>
+              </w:rPr>
+              <w:t>Physical MRI scanner with embedded firmware (proprietary operating system)</w:t>
+            </w:r>
+          </w:p>
+        </w:tc>
+      </w:tr>
+      <w:tr>
+        <w:tc>
+          <w:tcPr>
+            <w:tcW w:type="dxa" w:w="4320"/>
+          </w:tcPr>
+          <w:p>
+            <w:r/>
+            <w:r>
+              <w:rPr>
+                <w:sz w:val="20"/>
+              </w:rPr>
+              <w:t>Acquisition workstation</w:t>
+            </w:r>
+          </w:p>
+        </w:tc>
+        <w:tc>
+          <w:tcPr>
+            <w:tcW w:type="dxa" w:w="4320"/>
+          </w:tcPr>
+          <w:p>
+            <w:r/>
+            <w:r>
+              <w:rPr>
+                <w:sz w:val="20"/>
+              </w:rPr>
+              <w:t>PC connected to the imaging unit. Runs the scanning software and a local admin console accessible on the hospital network.</w:t>
+            </w:r>
+          </w:p>
+        </w:tc>
+      </w:tr>
+      <w:tr>
+        <w:tc>
+          <w:tcPr>
+            <w:tcW w:type="dxa" w:w="4320"/>
+          </w:tcPr>
+          <w:p>
+            <w:r/>
+            <w:r>
+              <w:rPr>
+                <w:sz w:val="20"/>
+              </w:rPr>
+              <w:t>Local DICOM server</w:t>
+            </w:r>
+          </w:p>
+        </w:tc>
+        <w:tc>
+          <w:tcPr>
+            <w:tcW w:type="dxa" w:w="4320"/>
+          </w:tcPr>
+          <w:p>
+            <w:r/>
+            <w:r>
+              <w:rPr>
+                <w:sz w:val="20"/>
+              </w:rPr>
+              <w:t>Stores scan images on-site. Connected to the hospital network.</w:t>
+            </w:r>
+          </w:p>
+        </w:tc>
+      </w:tr>
+    </w:tbl>
+    <w:p/>
+    <w:p>
+      <w:pPr>
+        <w:pStyle w:val="Heading3"/>
+      </w:pPr>
+      <w:r>
+        <w:t>Cloud (MediScanTech-operated)</w:t>
+      </w:r>
+    </w:p>
+    <w:tbl>
+      <w:tblPr>
+        <w:tblStyle w:val="TableGrid"/>
+        <w:tblW w:type="auto" w:w="0"/>
+        <w:tblLook w:firstColumn="1" w:firstRow="1" w:lastColumn="0" w:lastRow="0" w:noHBand="0" w:noVBand="1" w:val="04A0"/>
+      </w:tblPr>
+      <w:tblGrid>
+        <w:gridCol w:w="4320"/>
+        <w:gridCol w:w="4320"/>
+      </w:tblGrid>
+      <w:tr>
+        <w:tc>
+          <w:tcPr>
+            <w:tcW w:type="dxa" w:w="4320"/>
+            <w:shd w:val="clear" w:color="auto" w:fill="1F497D"/>
+          </w:tcPr>
+          <w:p>
+            <w:r/>
+            <w:r>
+              <w:rPr>
+                <w:b/>
+                <w:color w:val="FFFFFF"/>
+                <w:sz w:val="20"/>
+              </w:rPr>
+              <w:t>Component</w:t>
+            </w:r>
+          </w:p>
+        </w:tc>
+        <w:tc>
+          <w:tcPr>
+            <w:tcW w:type="dxa" w:w="4320"/>
+            <w:shd w:val="clear" w:color="auto" w:fill="1F497D"/>
+          </w:tcPr>
+          <w:p>
+            <w:r/>
+            <w:r>
+              <w:rPr>
+                <w:b/>
+                <w:color w:val="FFFFFF"/>
+                <w:sz w:val="20"/>
+              </w:rPr>
+              <w:t>Description</w:t>
+            </w:r>
+          </w:p>
+        </w:tc>
+      </w:tr>
+      <w:tr>
+        <w:tc>
+          <w:tcPr>
+            <w:tcW w:type="dxa" w:w="4320"/>
+          </w:tcPr>
+          <w:p>
+            <w:r/>
+            <w:r>
+              <w:rPr>
+                <w:sz w:val="20"/>
+              </w:rPr>
+              <w:t>AI inference service</w:t>
+            </w:r>
+          </w:p>
+        </w:tc>
+        <w:tc>
+          <w:tcPr>
+            <w:tcW w:type="dxa" w:w="4320"/>
+          </w:tcPr>
+          <w:p>
+            <w:r/>
+            <w:r>
+              <w:rPr>
+                <w:sz w:val="20"/>
+              </w:rPr>
+              <w:t>Receives anonymised scan images, runs the AI diagnostic model, and returns annotations</w:t>
+            </w:r>
+          </w:p>
+        </w:tc>
+      </w:tr>
+      <w:tr>
+        <w:tc>
+          <w:tcPr>
+            <w:tcW w:type="dxa" w:w="4320"/>
+          </w:tcPr>
+          <w:p>
+            <w:r/>
+            <w:r>
+              <w:rPr>
+                <w:sz w:val="20"/>
+              </w:rPr>
+              <w:t>Cloud storage</w:t>
+            </w:r>
+          </w:p>
+        </w:tc>
+        <w:tc>
+          <w:tcPr>
+            <w:tcW w:type="dxa" w:w="4320"/>
+          </w:tcPr>
+          <w:p>
+            <w:r/>
+            <w:r>
+              <w:rPr>
+                <w:sz w:val="20"/>
+              </w:rPr>
+              <w:t>Stores anonymised images and AI outputs</w:t>
+            </w:r>
+          </w:p>
+        </w:tc>
+      </w:tr>
+      <w:tr>
+        <w:tc>
+          <w:tcPr>
+            <w:tcW w:type="dxa" w:w="4320"/>
+          </w:tcPr>
+          <w:p>
+            <w:r/>
+            <w:r>
+              <w:rPr>
+                <w:sz w:val="20"/>
+              </w:rPr>
+              <w:t>Update delivery service</w:t>
+            </w:r>
+          </w:p>
+        </w:tc>
+        <w:tc>
+          <w:tcPr>
+            <w:tcW w:type="dxa" w:w="4320"/>
+          </w:tcPr>
+          <w:p>
+            <w:r/>
+            <w:r>
+              <w:rPr>
+                <w:sz w:val="20"/>
+              </w:rPr>
+              <w:t>Delivers firmware and software updates to on-premise components</w:t>
+            </w:r>
+          </w:p>
+        </w:tc>
+      </w:tr>
+      <w:tr>
+        <w:tc>
+          <w:tcPr>
+            <w:tcW w:type="dxa" w:w="4320"/>
+          </w:tcPr>
+          <w:p>
+            <w:r/>
+            <w:r>
+              <w:rPr>
+                <w:sz w:val="20"/>
+              </w:rPr>
+              <w:t>Manufacturer backend</w:t>
+            </w:r>
+          </w:p>
+        </w:tc>
+        <w:tc>
+          <w:tcPr>
+            <w:tcW w:type="dxa" w:w="4320"/>
+          </w:tcPr>
+          <w:p>
+            <w:r/>
+            <w:r>
+              <w:rPr>
+                <w:sz w:val="20"/>
+              </w:rPr>
+              <w:t>MediScanTech internal systems: model training, monitoring, remote support</w:t>
+            </w:r>
+          </w:p>
+        </w:tc>
+      </w:tr>
+    </w:tbl>
+    <w:p/>
+    <w:p>
+      <w:pPr>
+        <w:pStyle w:val="Heading2"/>
+      </w:pPr>
+      <w:r>
+        <w:t>How a scan works (data flow)</w:t>
+      </w:r>
+    </w:p>
+    <w:p>
+      <w:pPr>
+        <w:pStyle w:val="ListNumber"/>
+      </w:pPr>
+      <w:r>
+        <w:t>Patient undergoes scan → imaging unit captures raw data</w:t>
+      </w:r>
+    </w:p>
+    <w:p>
+      <w:pPr>
+        <w:pStyle w:val="ListNumber"/>
+      </w:pPr>
+      <w:r>
+        <w:t>Acquisition workstation processes the raw data → creates DICOM images</w:t>
+      </w:r>
+    </w:p>
+    <w:p>
+      <w:pPr>
+        <w:pStyle w:val="ListNumber"/>
+      </w:pPr>
+      <w:r>
+        <w:t>Images stored on the local DICOM server</w:t>
+      </w:r>
+    </w:p>
+    <w:p>
+      <w:pPr>
+        <w:pStyle w:val="ListNumber"/>
+      </w:pPr>
+      <w:r>
+        <w:t>Anonymised images sent to the cloud AI inference service (encrypted)</w:t>
+      </w:r>
+    </w:p>
+    <w:p>
+      <w:pPr>
+        <w:pStyle w:val="ListNumber"/>
+      </w:pPr>
+      <w:r>
+        <w:t>Cloud returns AI diagnostic annotations → displayed to radiologist on the workstation</w:t>
+      </w:r>
+    </w:p>
+    <w:p>
+      <w:pPr>
+        <w:pStyle w:val="ListNumber"/>
+      </w:pPr>
+      <w:r>
+        <w:t>MediScanTech pushes firmware and software updates to the workstation and imaging unit</w:t>
+      </w:r>
+    </w:p>
+    <w:p>
+      <w:pPr>
+        <w:pStyle w:val="Heading2"/>
+      </w:pPr>
+      <w:r>
+        <w:t>Users and roles</w:t>
+      </w:r>
+    </w:p>
+    <w:tbl>
+      <w:tblPr>
+        <w:tblStyle w:val="TableGrid"/>
+        <w:tblW w:type="auto" w:w="0"/>
+        <w:tblLook w:firstColumn="1" w:firstRow="1" w:lastColumn="0" w:lastRow="0" w:noHBand="0" w:noVBand="1" w:val="04A0"/>
+      </w:tblPr>
+      <w:tblGrid>
+        <w:gridCol w:w="2880"/>
+        <w:gridCol w:w="2880"/>
+        <w:gridCol w:w="2880"/>
+      </w:tblGrid>
+      <w:tr>
+        <w:tc>
+          <w:tcPr>
+            <w:tcW w:type="dxa" w:w="2880"/>
+            <w:shd w:val="clear" w:color="auto" w:fill="1F497D"/>
+          </w:tcPr>
+          <w:p>
+            <w:r/>
+            <w:r>
+              <w:rPr>
+                <w:b/>
+                <w:color w:val="FFFFFF"/>
+                <w:sz w:val="20"/>
+              </w:rPr>
+              <w:t>Role</w:t>
+            </w:r>
+          </w:p>
+        </w:tc>
+        <w:tc>
+          <w:tcPr>
+            <w:tcW w:type="dxa" w:w="2880"/>
+            <w:shd w:val="clear" w:color="auto" w:fill="1F497D"/>
+          </w:tcPr>
+          <w:p>
+            <w:r/>
+            <w:r>
+              <w:rPr>
+                <w:b/>
+                <w:color w:val="FFFFFF"/>
+                <w:sz w:val="20"/>
+              </w:rPr>
+              <w:t>What they do</w:t>
+            </w:r>
+          </w:p>
+        </w:tc>
+        <w:tc>
+          <w:tcPr>
+            <w:tcW w:type="dxa" w:w="2880"/>
+            <w:shd w:val="clear" w:color="auto" w:fill="1F497D"/>
+          </w:tcPr>
+          <w:p>
+            <w:r/>
+            <w:r>
+              <w:rPr>
+                <w:b/>
+                <w:color w:val="FFFFFF"/>
+                <w:sz w:val="20"/>
+              </w:rPr>
+              <w:t>Where they access from</w:t>
+            </w:r>
+          </w:p>
+        </w:tc>
+      </w:tr>
+      <w:tr>
+        <w:tc>
+          <w:tcPr>
+            <w:tcW w:type="dxa" w:w="2880"/>
+          </w:tcPr>
+          <w:p>
+            <w:r/>
+            <w:r>
+              <w:rPr>
+                <w:sz w:val="20"/>
+              </w:rPr>
+              <w:t>Radiologist</w:t>
+            </w:r>
+          </w:p>
+        </w:tc>
+        <w:tc>
+          <w:tcPr>
+            <w:tcW w:type="dxa" w:w="2880"/>
+          </w:tcPr>
+          <w:p>
+            <w:r/>
+            <w:r>
+              <w:rPr>
+                <w:sz w:val="20"/>
+              </w:rPr>
+              <w:t>Views images and AI annotations, signs diagnostic reports</w:t>
+            </w:r>
+          </w:p>
+        </w:tc>
+        <w:tc>
+          <w:tcPr>
+            <w:tcW w:type="dxa" w:w="2880"/>
+          </w:tcPr>
+          <w:p>
+            <w:r/>
+            <w:r>
+              <w:rPr>
+                <w:sz w:val="20"/>
+              </w:rPr>
+              <w:t>Hospital workstation</w:t>
+            </w:r>
+          </w:p>
+        </w:tc>
+      </w:tr>
+      <w:tr>
+        <w:tc>
+          <w:tcPr>
+            <w:tcW w:type="dxa" w:w="2880"/>
+          </w:tcPr>
+          <w:p>
+            <w:r/>
+            <w:r>
+              <w:rPr>
+                <w:sz w:val="20"/>
+              </w:rPr>
+              <w:t>Biomedical engineer</w:t>
+            </w:r>
+          </w:p>
+        </w:tc>
+        <w:tc>
+          <w:tcPr>
+            <w:tcW w:type="dxa" w:w="2880"/>
+          </w:tcPr>
+          <w:p>
+            <w:r/>
+            <w:r>
+              <w:rPr>
+                <w:sz w:val="20"/>
+              </w:rPr>
+              <w:t>Maintains the device, accesses local admin console</w:t>
+            </w:r>
+          </w:p>
+        </w:tc>
+        <w:tc>
+          <w:tcPr>
+            <w:tcW w:type="dxa" w:w="2880"/>
+          </w:tcPr>
+          <w:p>
+            <w:r/>
+            <w:r>
+              <w:rPr>
+                <w:sz w:val="20"/>
+              </w:rPr>
+              <w:t>Hospital (on-site)</w:t>
+            </w:r>
+          </w:p>
+        </w:tc>
+      </w:tr>
+      <w:tr>
+        <w:tc>
+          <w:tcPr>
+            <w:tcW w:type="dxa" w:w="2880"/>
+          </w:tcPr>
+          <w:p>
+            <w:r/>
+            <w:r>
+              <w:rPr>
+                <w:sz w:val="20"/>
+              </w:rPr>
+              <w:t>Hospital IT admin</w:t>
+            </w:r>
+          </w:p>
+        </w:tc>
+        <w:tc>
+          <w:tcPr>
+            <w:tcW w:type="dxa" w:w="2880"/>
+          </w:tcPr>
+          <w:p>
+            <w:r/>
+            <w:r>
+              <w:rPr>
+                <w:sz w:val="20"/>
+              </w:rPr>
+              <w:t>Manages network and local server</w:t>
+            </w:r>
+          </w:p>
+        </w:tc>
+        <w:tc>
+          <w:tcPr>
+            <w:tcW w:type="dxa" w:w="2880"/>
+          </w:tcPr>
+          <w:p>
+            <w:r/>
+            <w:r>
+              <w:rPr>
+                <w:sz w:val="20"/>
+              </w:rPr>
+              <w:t>Hospital network</w:t>
+            </w:r>
+          </w:p>
+        </w:tc>
+      </w:tr>
+      <w:tr>
+        <w:tc>
+          <w:tcPr>
+            <w:tcW w:type="dxa" w:w="2880"/>
+          </w:tcPr>
+          <w:p>
+            <w:r/>
+            <w:r>
+              <w:rPr>
+                <w:sz w:val="20"/>
+              </w:rPr>
+              <w:t>MediScanTech support</w:t>
+            </w:r>
+          </w:p>
+        </w:tc>
+        <w:tc>
+          <w:tcPr>
+            <w:tcW w:type="dxa" w:w="2880"/>
+          </w:tcPr>
+          <w:p>
+            <w:r/>
+            <w:r>
+              <w:rPr>
+                <w:sz w:val="20"/>
+              </w:rPr>
+              <w:t>Remote access for diagnostics and troubleshooting</w:t>
+            </w:r>
+          </w:p>
+        </w:tc>
+        <w:tc>
+          <w:tcPr>
+            <w:tcW w:type="dxa" w:w="2880"/>
+          </w:tcPr>
+          <w:p>
+            <w:r/>
+            <w:r>
+              <w:rPr>
+                <w:sz w:val="20"/>
+              </w:rPr>
+              <w:t>Internet</w:t>
+            </w:r>
+          </w:p>
+        </w:tc>
+      </w:tr>
+      <w:tr>
+        <w:tc>
+          <w:tcPr>
+            <w:tcW w:type="dxa" w:w="2880"/>
+          </w:tcPr>
+          <w:p>
+            <w:r/>
+            <w:r>
+              <w:rPr>
+                <w:sz w:val="20"/>
+              </w:rPr>
+              <w:t>MediScanTech engineer</w:t>
+            </w:r>
+          </w:p>
+        </w:tc>
+        <w:tc>
+          <w:tcPr>
+            <w:tcW w:type="dxa" w:w="2880"/>
+          </w:tcPr>
+          <w:p>
+            <w:r/>
+            <w:r>
+              <w:rPr>
+                <w:sz w:val="20"/>
+              </w:rPr>
+              <w:t>Manages cloud backend and update delivery</w:t>
+            </w:r>
+          </w:p>
+        </w:tc>
+        <w:tc>
+          <w:tcPr>
+            <w:tcW w:type="dxa" w:w="2880"/>
+          </w:tcPr>
+          <w:p>
+            <w:r/>
+            <w:r>
+              <w:rPr>
+                <w:sz w:val="20"/>
+              </w:rPr>
+              <w:t>MediScanTech datacentre</w:t>
+            </w:r>
+          </w:p>
+        </w:tc>
+      </w:tr>
+    </w:tbl>
+    <w:p/>
+    <w:p>
+      <w:pPr>
+        <w:pStyle w:val="Heading2"/>
+      </w:pPr>
+      <w:r>
+        <w:t>Key security assumptions (read carefully)</w:t>
+      </w:r>
+    </w:p>
+    <w:p>
+      <w:pPr>
+        <w:pStyle w:val="ListBullet"/>
+      </w:pPr>
+      <w:r>
+        <w:t>The acquisition workstation is connected to the internet — it talks to the cloud AI service and receives updates</w:t>
+      </w:r>
+    </w:p>
+    <w:p>
+      <w:pPr>
+        <w:pStyle w:val="ListBullet"/>
+      </w:pPr>
+      <w:r>
+        <w:t>The hospital network is shared with other hospital systems (not a dedicated medical-only network)</w:t>
+      </w:r>
+    </w:p>
+    <w:p>
+      <w:pPr>
+        <w:pStyle w:val="ListBullet"/>
+      </w:pPr>
+      <w:r>
+        <w:t>The local admin console has no multi-factor authentication and is reachable from anywhere on the hospital network</w:t>
+      </w:r>
+    </w:p>
+    <w:p>
+      <w:pPr>
+        <w:pStyle w:val="ListBullet"/>
+      </w:pPr>
+      <w:r>
+        <w:t>Remote support uses a shared credential — one login used by all MediScanTech support staff (known gap)</w:t>
+      </w:r>
+    </w:p>
+    <w:p>
+      <w:pPr>
+        <w:pStyle w:val="ListBullet"/>
+      </w:pPr>
+      <w:r>
+        <w:t>Anonymisation of images before cloud upload is done in software and has not been independently audited</w:t>
+      </w:r>
+    </w:p>
+    <w:p>
+      <w:pPr>
+        <w:pStyle w:val="ListBullet"/>
+      </w:pPr>
+      <w:r>
+        <w:t>The imaging unit firmware is patched approximately every 18 months due to regulatory constraints</w:t>
+      </w:r>
+    </w:p>
+    <w:p>
+      <w:pPr>
+        <w:pStyle w:val="Heading2"/>
+      </w:pPr>
+      <w:r>
+        <w:t>Architecture diagram</w:t>
+      </w:r>
+    </w:p>
+    <w:p>
+      <w:r>
+        <w:rPr>
+          <w:i/>
+          <w:color w:val="555555"/>
+          <w:sz w:val="20"/>
+        </w:rPr>
+        <w:t>Monospaced ASCII diagram — best viewed in a fixed-width font.</w:t>
+      </w:r>
+    </w:p>
+    <w:p>
+      <w:r>
+        <w:rPr>
+          <w:rFonts w:ascii="Consolas" w:hAnsi="Consolas"/>
+          <w:sz w:val="14"/>
+        </w:rPr>
+        <w:t>┌──────────────────────────────────────────────────────────────────┐</w:t>
+        <w:br/>
+        <w:t>│  HOSPITAL NETWORK                                                  │</w:t>
+        <w:br/>
+        <w:t>│                                                                    │</w:t>
+        <w:br/>
+        <w:t>│  ┌──────────────┐    USB /      ┌────────────────────────────┐     │</w:t>
+        <w:br/>
+        <w:t>│  │  Imaging     │  Proprietary  │  Acquisition Workstation    │     │</w:t>
+        <w:br/>
+        <w:t>│  │  Unit        │◄─────────────►│  (Windows 10)               │     │</w:t>
+        <w:br/>
+        <w:t>│  │  (RTOS)      │   Protocol    │  Scanning software          │     │</w:t>
+        <w:br/>
+        <w:t>│  │              │               │  Admin console (:8443)      │     │</w:t>
+        <w:br/>
+        <w:t>│  └──────────────┘               └──────────┬─────────────────┘     │</w:t>
+        <w:br/>
+        <w:t>│                                        Hospital LAN                 │</w:t>
+        <w:br/>
+        <w:t>│                               ┌────────────▼───────────┐           │</w:t>
+        <w:br/>
+        <w:t>│                               │  Local DICOM Server     │           │</w:t>
+        <w:br/>
+        <w:t>│                               │  (stores scan images)   │           │</w:t>
+        <w:br/>
+        <w:t>│                               └────────────────────────┘           │</w:t>
+        <w:br/>
+        <w:t>└──────────────────────────┬────────────────────────────────────────┘</w:t>
+        <w:br/>
+        <w:t xml:space="preserve">                           │ Internet (TLS 1.3, mutual TLS)</w:t>
+        <w:br/>
+        <w:t>┌──────────────────────────▼────────────────────────────────────────┐</w:t>
+        <w:br/>
+        <w:t>│  MEDISCANTECH CLOUD                                                 │</w:t>
+        <w:br/>
+        <w:t>│  ┌──────────────────┐   ┌──────────────────┐                       │</w:t>
+        <w:br/>
+        <w:t>│  │  AI Inference    │◄──│  Cloud Storage   │                       │</w:t>
+        <w:br/>
+        <w:t>│  │  Service (REST)  │   │  (anon. images)  │                       │</w:t>
+        <w:br/>
+        <w:t>│  └──────────────────┘   └──────────────────┘                       │</w:t>
+        <w:br/>
+        <w:t>│  ┌──────────────────────────────────────────────────────────────┐ │</w:t>
+        <w:br/>
+        <w:t>│  │  Manufacturer Backend (training, monitoring, support)         │ │</w:t>
+        <w:br/>
+        <w:t>│  └──────────────────────────────────────────────────────────────┘ │</w:t>
+        <w:br/>
+        <w:t>│  ┌──────────────────────────────────────────────────────────────┐ │</w:t>
+        <w:br/>
+        <w:t>│  │  Update Delivery Service                                      │ │</w:t>
+        <w:br/>
+        <w:t>│  └──────────────────────────────┬───────────────────────────────┘ │</w:t>
+        <w:br/>
+        <w:t>└─────────────────────────────────┼──────────────────────────────────┘</w:t>
+        <w:br/>
+        <w:t xml:space="preserve">                                  │ Updates (TLS, signed packages)</w:t>
+        <w:br/>
+        <w:t xml:space="preserve">                                  ▼</w:t>
+        <w:br/>
+        <w:t xml:space="preserve">                     [Workstation + Imaging Unit firmware]</w:t>
+      </w:r>
+    </w:p>
+    <w:p>
+      <w:pPr>
+        <w:pStyle w:val="Heading2"/>
+      </w:pPr>
+      <w:r>
+        <w:t>Trust boundaries</w:t>
+      </w:r>
+    </w:p>
+    <w:tbl>
+      <w:tblPr>
+        <w:tblStyle w:val="TableGrid"/>
+        <w:tblW w:type="auto" w:w="0"/>
+        <w:tblLook w:firstColumn="1" w:firstRow="1" w:lastColumn="0" w:lastRow="0" w:noHBand="0" w:noVBand="1" w:val="04A0"/>
+      </w:tblPr>
+      <w:tblGrid>
+        <w:gridCol w:w="2880"/>
+        <w:gridCol w:w="2880"/>
+        <w:gridCol w:w="2880"/>
+      </w:tblGrid>
+      <w:tr>
+        <w:tc>
+          <w:tcPr>
+            <w:tcW w:type="dxa" w:w="2880"/>
+            <w:shd w:val="clear" w:color="auto" w:fill="1F497D"/>
+          </w:tcPr>
+          <w:p>
+            <w:r/>
+            <w:r>
+              <w:rPr>
+                <w:b/>
+                <w:color w:val="FFFFFF"/>
+                <w:sz w:val="20"/>
+              </w:rPr>
+              <w:t>Boundary</w:t>
+            </w:r>
+          </w:p>
+        </w:tc>
+        <w:tc>
+          <w:tcPr>
+            <w:tcW w:type="dxa" w:w="2880"/>
+            <w:shd w:val="clear" w:color="auto" w:fill="1F497D"/>
+          </w:tcPr>
+          <w:p>
+            <w:r/>
+            <w:r>
+              <w:rPr>
+                <w:b/>
+                <w:color w:val="FFFFFF"/>
+                <w:sz w:val="20"/>
+              </w:rPr>
+              <w:t>Between</w:t>
+            </w:r>
+          </w:p>
+        </w:tc>
+        <w:tc>
+          <w:tcPr>
+            <w:tcW w:type="dxa" w:w="2880"/>
+            <w:shd w:val="clear" w:color="auto" w:fill="1F497D"/>
+          </w:tcPr>
+          <w:p>
+            <w:r/>
+            <w:r>
+              <w:rPr>
+                <w:b/>
+                <w:color w:val="FFFFFF"/>
+                <w:sz w:val="20"/>
+              </w:rPr>
+              <w:t>Notes</w:t>
+            </w:r>
+          </w:p>
+        </w:tc>
+      </w:tr>
+      <w:tr>
+        <w:tc>
+          <w:tcPr>
+            <w:tcW w:type="dxa" w:w="2880"/>
+          </w:tcPr>
+          <w:p>
+            <w:r/>
+            <w:r>
+              <w:rPr>
+                <w:sz w:val="20"/>
+              </w:rPr>
+              <w:t>TB-1</w:t>
+            </w:r>
+          </w:p>
+        </w:tc>
+        <w:tc>
+          <w:tcPr>
+            <w:tcW w:type="dxa" w:w="2880"/>
+          </w:tcPr>
+          <w:p>
+            <w:r/>
+            <w:r>
+              <w:rPr>
+                <w:sz w:val="20"/>
+              </w:rPr>
+              <w:t>Imaging unit ↔ Acquisition workstation</w:t>
+            </w:r>
+          </w:p>
+        </w:tc>
+        <w:tc>
+          <w:tcPr>
+            <w:tcW w:type="dxa" w:w="2880"/>
+          </w:tcPr>
+          <w:p>
+            <w:r/>
+            <w:r>
+              <w:rPr>
+                <w:sz w:val="20"/>
+              </w:rPr>
+              <w:t>Physical/proprietary — assumed trusted within the device</w:t>
+            </w:r>
+          </w:p>
+        </w:tc>
+      </w:tr>
+      <w:tr>
+        <w:tc>
+          <w:tcPr>
+            <w:tcW w:type="dxa" w:w="2880"/>
+          </w:tcPr>
+          <w:p>
+            <w:r/>
+            <w:r>
+              <w:rPr>
+                <w:sz w:val="20"/>
+              </w:rPr>
+              <w:t>TB-2</w:t>
+            </w:r>
+          </w:p>
+        </w:tc>
+        <w:tc>
+          <w:tcPr>
+            <w:tcW w:type="dxa" w:w="2880"/>
+          </w:tcPr>
+          <w:p>
+            <w:r/>
+            <w:r>
+              <w:rPr>
+                <w:sz w:val="20"/>
+              </w:rPr>
+              <w:t>Acquisition workstation ↔ Hospital LAN</w:t>
+            </w:r>
+          </w:p>
+        </w:tc>
+        <w:tc>
+          <w:tcPr>
+            <w:tcW w:type="dxa" w:w="2880"/>
+          </w:tcPr>
+          <w:p>
+            <w:r/>
+            <w:r>
+              <w:rPr>
+                <w:sz w:val="20"/>
+              </w:rPr>
+              <w:t>Shared hospital network — may include non-medical systems</w:t>
+            </w:r>
+          </w:p>
+        </w:tc>
+      </w:tr>
+      <w:tr>
+        <w:tc>
+          <w:tcPr>
+            <w:tcW w:type="dxa" w:w="2880"/>
+          </w:tcPr>
+          <w:p>
+            <w:r/>
+            <w:r>
+              <w:rPr>
+                <w:sz w:val="20"/>
+              </w:rPr>
+              <w:t>TB-3</w:t>
+            </w:r>
+          </w:p>
+        </w:tc>
+        <w:tc>
+          <w:tcPr>
+            <w:tcW w:type="dxa" w:w="2880"/>
+          </w:tcPr>
+          <w:p>
+            <w:r/>
+            <w:r>
+              <w:rPr>
+                <w:sz w:val="20"/>
+              </w:rPr>
+              <w:t>Hospital LAN ↔ Local DICOM server</w:t>
+            </w:r>
+          </w:p>
+        </w:tc>
+        <w:tc>
+          <w:tcPr>
+            <w:tcW w:type="dxa" w:w="2880"/>
+          </w:tcPr>
+          <w:p>
+            <w:r/>
+            <w:r>
+              <w:rPr>
+                <w:sz w:val="20"/>
+              </w:rPr>
+              <w:t>Internal — should be on a dedicated VLAN but often is not</w:t>
+            </w:r>
+          </w:p>
+        </w:tc>
+      </w:tr>
+      <w:tr>
+        <w:tc>
+          <w:tcPr>
+            <w:tcW w:type="dxa" w:w="2880"/>
+          </w:tcPr>
+          <w:p>
+            <w:r/>
+            <w:r>
+              <w:rPr>
+                <w:sz w:val="20"/>
+              </w:rPr>
+              <w:t>TB-4</w:t>
+            </w:r>
+          </w:p>
+        </w:tc>
+        <w:tc>
+          <w:tcPr>
+            <w:tcW w:type="dxa" w:w="2880"/>
+          </w:tcPr>
+          <w:p>
+            <w:r/>
+            <w:r>
+              <w:rPr>
+                <w:sz w:val="20"/>
+              </w:rPr>
+              <w:t>Hospital ↔ MediScanTech cloud</w:t>
+            </w:r>
+          </w:p>
+        </w:tc>
+        <w:tc>
+          <w:tcPr>
+            <w:tcW w:type="dxa" w:w="2880"/>
+          </w:tcPr>
+          <w:p>
+            <w:r/>
+            <w:r>
+              <w:rPr>
+                <w:sz w:val="20"/>
+              </w:rPr>
+              <w:t>Internet — protected by mutual TLS; main external boundary</w:t>
+            </w:r>
+          </w:p>
+        </w:tc>
+      </w:tr>
+      <w:tr>
+        <w:tc>
+          <w:tcPr>
+            <w:tcW w:type="dxa" w:w="2880"/>
+          </w:tcPr>
+          <w:p>
+            <w:r/>
+            <w:r>
+              <w:rPr>
+                <w:sz w:val="20"/>
+              </w:rPr>
+              <w:t>TB-5</w:t>
+            </w:r>
+          </w:p>
+        </w:tc>
+        <w:tc>
+          <w:tcPr>
+            <w:tcW w:type="dxa" w:w="2880"/>
+          </w:tcPr>
+          <w:p>
+            <w:r/>
+            <w:r>
+              <w:rPr>
+                <w:sz w:val="20"/>
+              </w:rPr>
+              <w:t>MediScanTech backend ↔ Update service</w:t>
+            </w:r>
+          </w:p>
+        </w:tc>
+        <w:tc>
+          <w:tcPr>
+            <w:tcW w:type="dxa" w:w="2880"/>
+          </w:tcPr>
+          <w:p>
+            <w:r/>
+            <w:r>
+              <w:rPr>
+                <w:sz w:val="20"/>
+              </w:rPr>
+              <w:t>Internal cloud — must be authenticated and integrity-protected</w:t>
+            </w:r>
+          </w:p>
+        </w:tc>
+      </w:tr>
+    </w:tbl>
+    <w:p/>
+    <w:p>
+      <w:pPr>
+        <w:pStyle w:val="Heading2"/>
+      </w:pPr>
+      <w:r>
+        <w:t>Data flows</w:t>
+      </w:r>
+    </w:p>
+    <w:tbl>
+      <w:tblPr>
+        <w:tblStyle w:val="TableGrid"/>
+        <w:tblW w:type="auto" w:w="0"/>
+        <w:tblLook w:firstColumn="1" w:firstRow="1" w:lastColumn="0" w:lastRow="0" w:noHBand="0" w:noVBand="1" w:val="04A0"/>
+      </w:tblPr>
+      <w:tblGrid>
+        <w:gridCol w:w="2880"/>
+        <w:gridCol w:w="2880"/>
+        <w:gridCol w:w="2880"/>
+      </w:tblGrid>
+      <w:tr>
+        <w:tc>
+          <w:tcPr>
+            <w:tcW w:type="dxa" w:w="2880"/>
+            <w:shd w:val="clear" w:color="auto" w:fill="1F497D"/>
+          </w:tcPr>
+          <w:p>
+            <w:r/>
+            <w:r>
+              <w:rPr>
+                <w:b/>
+                <w:color w:val="FFFFFF"/>
+                <w:sz w:val="20"/>
+              </w:rPr>
+              <w:t>Data</w:t>
+            </w:r>
+          </w:p>
+        </w:tc>
+        <w:tc>
+          <w:tcPr>
+            <w:tcW w:type="dxa" w:w="2880"/>
+            <w:shd w:val="clear" w:color="auto" w:fill="1F497D"/>
+          </w:tcPr>
+          <w:p>
+            <w:r/>
+            <w:r>
+              <w:rPr>
+                <w:b/>
+                <w:color w:val="FFFFFF"/>
+                <w:sz w:val="20"/>
+              </w:rPr>
+              <w:t>Sensitivity</w:t>
+            </w:r>
+          </w:p>
+        </w:tc>
+        <w:tc>
+          <w:tcPr>
+            <w:tcW w:type="dxa" w:w="2880"/>
+            <w:shd w:val="clear" w:color="auto" w:fill="1F497D"/>
+          </w:tcPr>
+          <w:p>
+            <w:r/>
+            <w:r>
+              <w:rPr>
+                <w:b/>
+                <w:color w:val="FFFFFF"/>
+                <w:sz w:val="20"/>
+              </w:rPr>
+              <w:t>Path</w:t>
+            </w:r>
+          </w:p>
+        </w:tc>
+      </w:tr>
+      <w:tr>
+        <w:tc>
+          <w:tcPr>
+            <w:tcW w:type="dxa" w:w="2880"/>
+          </w:tcPr>
+          <w:p>
+            <w:r/>
+            <w:r>
+              <w:rPr>
+                <w:sz w:val="20"/>
+              </w:rPr>
+              <w:t>Raw DICOM images (with patient data)</w:t>
+            </w:r>
+          </w:p>
+        </w:tc>
+        <w:tc>
+          <w:tcPr>
+            <w:tcW w:type="dxa" w:w="2880"/>
+          </w:tcPr>
+          <w:p>
+            <w:r/>
+            <w:r>
+              <w:rPr>
+                <w:sz w:val="20"/>
+              </w:rPr>
+              <w:t>High</w:t>
+            </w:r>
+          </w:p>
+        </w:tc>
+        <w:tc>
+          <w:tcPr>
+            <w:tcW w:type="dxa" w:w="2880"/>
+          </w:tcPr>
+          <w:p>
+            <w:r/>
+            <w:r>
+              <w:rPr>
+                <w:sz w:val="20"/>
+              </w:rPr>
+              <w:t>Imaging unit → Workstation → Local DICOM server</w:t>
+            </w:r>
+          </w:p>
+        </w:tc>
+      </w:tr>
+      <w:tr>
+        <w:tc>
+          <w:tcPr>
+            <w:tcW w:type="dxa" w:w="2880"/>
+          </w:tcPr>
+          <w:p>
+            <w:r/>
+            <w:r>
+              <w:rPr>
+                <w:sz w:val="20"/>
+              </w:rPr>
+              <w:t>Anonymised DICOM images</w:t>
+            </w:r>
+          </w:p>
+        </w:tc>
+        <w:tc>
+          <w:tcPr>
+            <w:tcW w:type="dxa" w:w="2880"/>
+          </w:tcPr>
+          <w:p>
+            <w:r/>
+            <w:r>
+              <w:rPr>
+                <w:sz w:val="20"/>
+              </w:rPr>
+              <w:t>Medium</w:t>
+            </w:r>
+          </w:p>
+        </w:tc>
+        <w:tc>
+          <w:tcPr>
+            <w:tcW w:type="dxa" w:w="2880"/>
+          </w:tcPr>
+          <w:p>
+            <w:r/>
+            <w:r>
+              <w:rPr>
+                <w:sz w:val="20"/>
+              </w:rPr>
+              <w:t>Local DICOM server → Cloud AI service → Cloud storage</w:t>
+            </w:r>
+          </w:p>
+        </w:tc>
+      </w:tr>
+      <w:tr>
+        <w:tc>
+          <w:tcPr>
+            <w:tcW w:type="dxa" w:w="2880"/>
+          </w:tcPr>
+          <w:p>
+            <w:r/>
+            <w:r>
+              <w:rPr>
+                <w:sz w:val="20"/>
+              </w:rPr>
+              <w:t>AI diagnostic annotations</w:t>
+            </w:r>
+          </w:p>
+        </w:tc>
+        <w:tc>
+          <w:tcPr>
+            <w:tcW w:type="dxa" w:w="2880"/>
+          </w:tcPr>
+          <w:p>
+            <w:r/>
+            <w:r>
+              <w:rPr>
+                <w:sz w:val="20"/>
+              </w:rPr>
+              <w:t>Medium</w:t>
+            </w:r>
+          </w:p>
+        </w:tc>
+        <w:tc>
+          <w:tcPr>
+            <w:tcW w:type="dxa" w:w="2880"/>
+          </w:tcPr>
+          <w:p>
+            <w:r/>
+            <w:r>
+              <w:rPr>
+                <w:sz w:val="20"/>
+              </w:rPr>
+              <w:t>Cloud → Workstation → Local DICOM server</w:t>
+            </w:r>
+          </w:p>
+        </w:tc>
+      </w:tr>
+      <w:tr>
+        <w:tc>
+          <w:tcPr>
+            <w:tcW w:type="dxa" w:w="2880"/>
+          </w:tcPr>
+          <w:p>
+            <w:r/>
+            <w:r>
+              <w:rPr>
+                <w:sz w:val="20"/>
+              </w:rPr>
+              <w:t>Device logs / telemetry</w:t>
+            </w:r>
+          </w:p>
+        </w:tc>
+        <w:tc>
+          <w:tcPr>
+            <w:tcW w:type="dxa" w:w="2880"/>
+          </w:tcPr>
+          <w:p>
+            <w:r/>
+            <w:r>
+              <w:rPr>
+                <w:sz w:val="20"/>
+              </w:rPr>
+              <w:t>Low–Medium</w:t>
+            </w:r>
+          </w:p>
+        </w:tc>
+        <w:tc>
+          <w:tcPr>
+            <w:tcW w:type="dxa" w:w="2880"/>
+          </w:tcPr>
+          <w:p>
+            <w:r/>
+            <w:r>
+              <w:rPr>
+                <w:sz w:val="20"/>
+              </w:rPr>
+              <w:t>Workstation → MediScanTech backend</w:t>
+            </w:r>
+          </w:p>
+        </w:tc>
+      </w:tr>
+      <w:tr>
+        <w:tc>
+          <w:tcPr>
+            <w:tcW w:type="dxa" w:w="2880"/>
+          </w:tcPr>
+          <w:p>
+            <w:r/>
+            <w:r>
+              <w:rPr>
+                <w:sz w:val="20"/>
+              </w:rPr>
+              <w:t>Firmware / software updates</w:t>
+            </w:r>
+          </w:p>
+        </w:tc>
+        <w:tc>
+          <w:tcPr>
+            <w:tcW w:type="dxa" w:w="2880"/>
+          </w:tcPr>
+          <w:p>
+            <w:r/>
+            <w:r>
+              <w:rPr>
+                <w:sz w:val="20"/>
+              </w:rPr>
+              <w:t>High (integrity)</w:t>
+            </w:r>
+          </w:p>
+        </w:tc>
+        <w:tc>
+          <w:tcPr>
+            <w:tcW w:type="dxa" w:w="2880"/>
+          </w:tcPr>
+          <w:p>
+            <w:r/>
+            <w:r>
+              <w:rPr>
+                <w:sz w:val="20"/>
+              </w:rPr>
+              <w:t>MediScanTech → Workstation + Imaging unit</w:t>
+            </w:r>
+          </w:p>
+        </w:tc>
+      </w:tr>
+      <w:tr>
+        <w:tc>
+          <w:tcPr>
+            <w:tcW w:type="dxa" w:w="2880"/>
+          </w:tcPr>
+          <w:p>
+            <w:r/>
+            <w:r>
+              <w:rPr>
+                <w:sz w:val="20"/>
+              </w:rPr>
+              <w:t>Admin credentials</w:t>
+            </w:r>
+          </w:p>
+        </w:tc>
+        <w:tc>
+          <w:tcPr>
+            <w:tcW w:type="dxa" w:w="2880"/>
+          </w:tcPr>
+          <w:p>
+            <w:r/>
+            <w:r>
+              <w:rPr>
+                <w:sz w:val="20"/>
+              </w:rPr>
+              <w:t>Critical</w:t>
+            </w:r>
+          </w:p>
+        </w:tc>
+        <w:tc>
+          <w:tcPr>
+            <w:tcW w:type="dxa" w:w="2880"/>
+          </w:tcPr>
+          <w:p>
+            <w:r/>
+            <w:r>
+              <w:rPr>
+                <w:sz w:val="20"/>
+              </w:rPr>
+              <w:t>Local admin console, remote support</w:t>
+            </w:r>
+          </w:p>
+        </w:tc>
+      </w:tr>
+    </w:tbl>
+    <w:p/>
+    <w:p>
+      <w:pPr>
+        <w:pStyle w:val="Heading2"/>
+      </w:pPr>
+      <w:r>
+        <w:t>Key interfaces</w:t>
+      </w:r>
+    </w:p>
+    <w:tbl>
+      <w:tblPr>
+        <w:tblStyle w:val="TableGrid"/>
+        <w:tblW w:type="auto" w:w="0"/>
+        <w:tblLook w:firstColumn="1" w:firstRow="1" w:lastColumn="0" w:lastRow="0" w:noHBand="0" w:noVBand="1" w:val="04A0"/>
+      </w:tblPr>
+      <w:tblGrid>
+        <w:gridCol w:w="2160"/>
+        <w:gridCol w:w="2160"/>
+        <w:gridCol w:w="2160"/>
+        <w:gridCol w:w="2160"/>
+      </w:tblGrid>
+      <w:tr>
+        <w:tc>
+          <w:tcPr>
+            <w:tcW w:type="dxa" w:w="2160"/>
+            <w:shd w:val="clear" w:color="auto" w:fill="1F497D"/>
+          </w:tcPr>
+          <w:p>
+            <w:r/>
+            <w:r>
+              <w:rPr>
+                <w:b/>
+                <w:color w:val="FFFFFF"/>
+                <w:sz w:val="20"/>
+              </w:rPr>
+              <w:t>Interface</w:t>
+            </w:r>
+          </w:p>
+        </w:tc>
+        <w:tc>
+          <w:tcPr>
+            <w:tcW w:type="dxa" w:w="2160"/>
+            <w:shd w:val="clear" w:color="auto" w:fill="1F497D"/>
+          </w:tcPr>
+          <w:p>
+            <w:r/>
+            <w:r>
+              <w:rPr>
+                <w:b/>
+                <w:color w:val="FFFFFF"/>
+                <w:sz w:val="20"/>
+              </w:rPr>
+              <w:t>Protocol</w:t>
+            </w:r>
+          </w:p>
+        </w:tc>
+        <w:tc>
+          <w:tcPr>
+            <w:tcW w:type="dxa" w:w="2160"/>
+            <w:shd w:val="clear" w:color="auto" w:fill="1F497D"/>
+          </w:tcPr>
+          <w:p>
+            <w:r/>
+            <w:r>
+              <w:rPr>
+                <w:b/>
+                <w:color w:val="FFFFFF"/>
+                <w:sz w:val="20"/>
+              </w:rPr>
+              <w:t>Authentication</w:t>
+            </w:r>
+          </w:p>
+        </w:tc>
+        <w:tc>
+          <w:tcPr>
+            <w:tcW w:type="dxa" w:w="2160"/>
+            <w:shd w:val="clear" w:color="auto" w:fill="1F497D"/>
+          </w:tcPr>
+          <w:p>
+            <w:r/>
+            <w:r>
+              <w:rPr>
+                <w:b/>
+                <w:color w:val="FFFFFF"/>
+                <w:sz w:val="20"/>
+              </w:rPr>
+              <w:t>Notes</w:t>
+            </w:r>
+          </w:p>
+        </w:tc>
+      </w:tr>
+      <w:tr>
+        <w:tc>
+          <w:tcPr>
+            <w:tcW w:type="dxa" w:w="2160"/>
+          </w:tcPr>
+          <w:p>
+            <w:r/>
+            <w:r>
+              <w:rPr>
+                <w:sz w:val="20"/>
+              </w:rPr>
+              <w:t>Imaging unit → Workstation</w:t>
+            </w:r>
+          </w:p>
+        </w:tc>
+        <w:tc>
+          <w:tcPr>
+            <w:tcW w:type="dxa" w:w="2160"/>
+          </w:tcPr>
+          <w:p>
+            <w:r/>
+            <w:r>
+              <w:rPr>
+                <w:sz w:val="20"/>
+              </w:rPr>
+              <w:t>Proprietary USB</w:t>
+            </w:r>
+          </w:p>
+        </w:tc>
+        <w:tc>
+          <w:tcPr>
+            <w:tcW w:type="dxa" w:w="2160"/>
+          </w:tcPr>
+          <w:p>
+            <w:r/>
+            <w:r>
+              <w:rPr>
+                <w:sz w:val="20"/>
+              </w:rPr>
+              <w:t>None (physical)</w:t>
+            </w:r>
+          </w:p>
+        </w:tc>
+        <w:tc>
+          <w:tcPr>
+            <w:tcW w:type="dxa" w:w="2160"/>
+          </w:tcPr>
+          <w:p>
+            <w:r/>
+            <w:r>
+              <w:rPr>
+                <w:sz w:val="20"/>
+              </w:rPr>
+              <w:t>Assumed trusted</w:t>
+            </w:r>
+          </w:p>
+        </w:tc>
+      </w:tr>
+      <w:tr>
+        <w:tc>
+          <w:tcPr>
+            <w:tcW w:type="dxa" w:w="2160"/>
+          </w:tcPr>
+          <w:p>
+            <w:r/>
+            <w:r>
+              <w:rPr>
+                <w:sz w:val="20"/>
+              </w:rPr>
+              <w:t>Workstation → Local DICOM server</w:t>
+            </w:r>
+          </w:p>
+        </w:tc>
+        <w:tc>
+          <w:tcPr>
+            <w:tcW w:type="dxa" w:w="2160"/>
+          </w:tcPr>
+          <w:p>
+            <w:r/>
+            <w:r>
+              <w:rPr>
+                <w:sz w:val="20"/>
+              </w:rPr>
+              <w:t>DICOM (TCP 104)</w:t>
+            </w:r>
+          </w:p>
+        </w:tc>
+        <w:tc>
+          <w:tcPr>
+            <w:tcW w:type="dxa" w:w="2160"/>
+          </w:tcPr>
+          <w:p>
+            <w:r/>
+            <w:r>
+              <w:rPr>
+                <w:sz w:val="20"/>
+              </w:rPr>
+              <w:t>None by default</w:t>
+            </w:r>
+          </w:p>
+        </w:tc>
+        <w:tc>
+          <w:tcPr>
+            <w:tcW w:type="dxa" w:w="2160"/>
+          </w:tcPr>
+          <w:p>
+            <w:r/>
+            <w:r>
+              <w:rPr>
+                <w:sz w:val="20"/>
+              </w:rPr>
+              <w:t>No built-in auth in most deployments</w:t>
+            </w:r>
+          </w:p>
+        </w:tc>
+      </w:tr>
+      <w:tr>
+        <w:tc>
+          <w:tcPr>
+            <w:tcW w:type="dxa" w:w="2160"/>
+          </w:tcPr>
+          <w:p>
+            <w:r/>
+            <w:r>
+              <w:rPr>
+                <w:sz w:val="20"/>
+              </w:rPr>
+              <w:t>Workstation → Cloud AI service</w:t>
+            </w:r>
+          </w:p>
+        </w:tc>
+        <w:tc>
+          <w:tcPr>
+            <w:tcW w:type="dxa" w:w="2160"/>
+          </w:tcPr>
+          <w:p>
+            <w:r/>
+            <w:r>
+              <w:rPr>
+                <w:sz w:val="20"/>
+              </w:rPr>
+              <w:t>HTTPS REST</w:t>
+            </w:r>
+          </w:p>
+        </w:tc>
+        <w:tc>
+          <w:tcPr>
+            <w:tcW w:type="dxa" w:w="2160"/>
+          </w:tcPr>
+          <w:p>
+            <w:r/>
+            <w:r>
+              <w:rPr>
+                <w:sz w:val="20"/>
+              </w:rPr>
+              <w:t>Mutual TLS + API key</w:t>
+            </w:r>
+          </w:p>
+        </w:tc>
+        <w:tc>
+          <w:tcPr>
+            <w:tcW w:type="dxa" w:w="2160"/>
+          </w:tcPr>
+          <w:p>
+            <w:r/>
+            <w:r>
+              <w:rPr>
+                <w:sz w:val="20"/>
+              </w:rPr>
+            </w:r>
+          </w:p>
+        </w:tc>
+      </w:tr>
+      <w:tr>
+        <w:tc>
+          <w:tcPr>
+            <w:tcW w:type="dxa" w:w="2160"/>
+          </w:tcPr>
+          <w:p>
+            <w:r/>
+            <w:r>
+              <w:rPr>
+                <w:sz w:val="20"/>
+              </w:rPr>
+              <w:t>Local admin console</w:t>
+            </w:r>
+          </w:p>
+        </w:tc>
+        <w:tc>
+          <w:tcPr>
+            <w:tcW w:type="dxa" w:w="2160"/>
+          </w:tcPr>
+          <w:p>
+            <w:r/>
+            <w:r>
+              <w:rPr>
+                <w:sz w:val="20"/>
+              </w:rPr>
+              <w:t>HTTPS (:8443)</w:t>
+            </w:r>
+          </w:p>
+        </w:tc>
+        <w:tc>
+          <w:tcPr>
+            <w:tcW w:type="dxa" w:w="2160"/>
+          </w:tcPr>
+          <w:p>
+            <w:r/>
+            <w:r>
+              <w:rPr>
+                <w:sz w:val="20"/>
+              </w:rPr>
+              <w:t>Username/password</w:t>
+            </w:r>
+          </w:p>
+        </w:tc>
+        <w:tc>
+          <w:tcPr>
+            <w:tcW w:type="dxa" w:w="2160"/>
+          </w:tcPr>
+          <w:p>
+            <w:r/>
+            <w:r>
+              <w:rPr>
+                <w:sz w:val="20"/>
+              </w:rPr>
+              <w:t>No MFA</w:t>
+            </w:r>
+          </w:p>
+        </w:tc>
+      </w:tr>
+      <w:tr>
+        <w:tc>
+          <w:tcPr>
+            <w:tcW w:type="dxa" w:w="2160"/>
+          </w:tcPr>
+          <w:p>
+            <w:r/>
+            <w:r>
+              <w:rPr>
+                <w:sz w:val="20"/>
+              </w:rPr>
+              <w:t>Remote support</w:t>
+            </w:r>
+          </w:p>
+        </w:tc>
+        <w:tc>
+          <w:tcPr>
+            <w:tcW w:type="dxa" w:w="2160"/>
+          </w:tcPr>
+          <w:p>
+            <w:r/>
+            <w:r>
+              <w:rPr>
+                <w:sz w:val="20"/>
+              </w:rPr>
+              <w:t>VPN + SSH</w:t>
+            </w:r>
+          </w:p>
+        </w:tc>
+        <w:tc>
+          <w:tcPr>
+            <w:tcW w:type="dxa" w:w="2160"/>
+          </w:tcPr>
+          <w:p>
+            <w:r/>
+            <w:r>
+              <w:rPr>
+                <w:sz w:val="20"/>
+              </w:rPr>
+              <w:t>Shared credential</w:t>
+            </w:r>
+          </w:p>
+        </w:tc>
+        <w:tc>
+          <w:tcPr>
+            <w:tcW w:type="dxa" w:w="2160"/>
+          </w:tcPr>
+          <w:p>
+            <w:r/>
+            <w:r>
+              <w:rPr>
+                <w:sz w:val="20"/>
+              </w:rPr>
+              <w:t>Known security gap</w:t>
+            </w:r>
+          </w:p>
+        </w:tc>
+      </w:tr>
+      <w:tr>
+        <w:tc>
+          <w:tcPr>
+            <w:tcW w:type="dxa" w:w="2160"/>
+          </w:tcPr>
+          <w:p>
+            <w:r/>
+            <w:r>
+              <w:rPr>
+                <w:sz w:val="20"/>
+              </w:rPr>
+              <w:t>Update delivery</w:t>
+            </w:r>
+          </w:p>
+        </w:tc>
+        <w:tc>
+          <w:tcPr>
+            <w:tcW w:type="dxa" w:w="2160"/>
+          </w:tcPr>
+          <w:p>
+            <w:r/>
+            <w:r>
+              <w:rPr>
+                <w:sz w:val="20"/>
+              </w:rPr>
+              <w:t>HTTPS</w:t>
+            </w:r>
+          </w:p>
+        </w:tc>
+        <w:tc>
+          <w:tcPr>
+            <w:tcW w:type="dxa" w:w="2160"/>
+          </w:tcPr>
+          <w:p>
+            <w:r/>
+            <w:r>
+              <w:rPr>
+                <w:sz w:val="20"/>
+              </w:rPr>
+              <w:t>Package signing (RSA-2048) + TLS</w:t>
+            </w:r>
+          </w:p>
+        </w:tc>
+        <w:tc>
+          <w:tcPr>
+            <w:tcW w:type="dxa" w:w="2160"/>
+          </w:tcPr>
+          <w:p>
+            <w:r/>
+            <w:r>
+              <w:rPr>
+                <w:sz w:val="20"/>
+              </w:rPr>
+            </w:r>
+          </w:p>
+        </w:tc>
+      </w:tr>
+    </w:tbl>
+    <w:p/>
+    <w:p>
+      <w:r>
+        <w:br w:type="page"/>
+      </w:r>
+    </w:p>
+    <w:p>
+      <w:pPr>
+        <w:pStyle w:val="Heading1"/>
+      </w:pPr>
+      <w:r>
+        <w:t>Threat Model Worksheet — NeuroScan 3000</w:t>
       </w:r>
     </w:p>
     <w:p>

</xml_diff>

<commit_message>
Drop intro section and render architecture diagram as an embedded image
The generated participant .docx now contains two sections: Product &
Architecture and the fillable worksheet. The workshop introduction is
no longer duplicated in the document; it stays in
workshop/00-introduction.md and the facilitator shares it from the repo.

The architecture diagram was previously ASCII box-art, which relies on a
monospaced font and exact column alignment and rendered broken after
Google Docs import. It is now drawn with matplotlib and embedded as a
PNG (render_architecture_png), so it displays identically in Word and
Google Docs. Adds matplotlib as a generator dependency.

Co-authored-by: Ona <no-reply@ona.com>
</commit_message>
<xml_diff>
--- a/templates/threat-model-template.docx
+++ b/templates/threat-model-template.docx
@@ -2,686 +2,6 @@
 <file path=word/document.xml><?xml version="1.0" encoding="utf-8"?>
 <w:document xmlns:wpc="http://schemas.microsoft.com/office/word/2010/wordprocessingCanvas" xmlns:mo="http://schemas.microsoft.com/office/mac/office/2008/main" xmlns:mc="http://schemas.openxmlformats.org/markup-compatibility/2006" xmlns:mv="urn:schemas-microsoft-com:mac:vml" xmlns:o="urn:schemas-microsoft-com:office:office" xmlns:r="http://schemas.openxmlformats.org/officeDocument/2006/relationships" xmlns:m="http://schemas.openxmlformats.org/officeDocument/2006/math" xmlns:v="urn:schemas-microsoft-com:vml" xmlns:wp14="http://schemas.microsoft.com/office/word/2010/wordprocessingDrawing" xmlns:wp="http://schemas.openxmlformats.org/drawingml/2006/wordprocessingDrawing" xmlns:w10="urn:schemas-microsoft-com:office:word" xmlns:w="http://schemas.openxmlformats.org/wordprocessingml/2006/main" xmlns:w14="http://schemas.microsoft.com/office/word/2010/wordml" xmlns:wpg="http://schemas.microsoft.com/office/word/2010/wordprocessingGroup" xmlns:wpi="http://schemas.microsoft.com/office/word/2010/wordprocessingInk" xmlns:wne="http://schemas.microsoft.com/office/word/2006/wordml" xmlns:wps="http://schemas.microsoft.com/office/word/2010/wordprocessingShape" mc:Ignorable="w14 wp14">
   <w:body>
-    <w:p>
-      <w:pPr>
-        <w:pStyle w:val="Heading1"/>
-      </w:pPr>
-      <w:r>
-        <w:t>Introduction — Why Threat Model Medical Devices?</w:t>
-      </w:r>
-    </w:p>
-    <w:p>
-      <w:pPr>
-        <w:pStyle w:val="Heading2"/>
-      </w:pPr>
-      <w:r>
-        <w:t>What is threat modeling?</w:t>
-      </w:r>
-    </w:p>
-    <w:p>
-      <w:r>
-        <w:t>Threat modeling is a structured process for identifying security and safety threats to a system, assessing their risk, and designing countermeasures — before an attacker does it for you.</w:t>
-      </w:r>
-    </w:p>
-    <w:p>
-      <w:r>
-        <w:t>At its core it answers four questions:</w:t>
-      </w:r>
-    </w:p>
-    <w:p>
-      <w:pPr>
-        <w:pStyle w:val="ListNumber"/>
-      </w:pPr>
-      <w:r>
-        <w:t>What are we working on? — system decomposition and scoping</w:t>
-      </w:r>
-    </w:p>
-    <w:p>
-      <w:pPr>
-        <w:pStyle w:val="ListNumber"/>
-      </w:pPr>
-      <w:r>
-        <w:t>What can go wrong? — threat identification and risk assessment</w:t>
-      </w:r>
-    </w:p>
-    <w:p>
-      <w:pPr>
-        <w:pStyle w:val="ListNumber"/>
-      </w:pPr>
-      <w:r>
-        <w:t>What are we going to do about it? — mitigations and controls</w:t>
-      </w:r>
-    </w:p>
-    <w:p>
-      <w:pPr>
-        <w:pStyle w:val="ListNumber"/>
-      </w:pPr>
-      <w:r>
-        <w:t>Did we do a good job? — validation and review</w:t>
-      </w:r>
-    </w:p>
-    <w:p>
-      <w:pPr>
-        <w:pStyle w:val="Heading2"/>
-      </w:pPr>
-      <w:r>
-        <w:t>Why does it matter for medical devices?</w:t>
-      </w:r>
-    </w:p>
-    <w:p>
-      <w:r>
-        <w:t>Medical devices are increasingly software-defined and network-connected. This creates new attack surfaces that didn't exist a decade ago.</w:t>
-      </w:r>
-    </w:p>
-    <w:p>
-      <w:r>
-        <w:rPr>
-          <w:b/>
-        </w:rPr>
-        <w:t>The stakes are uniquely high:</w:t>
-      </w:r>
-    </w:p>
-    <w:p>
-      <w:pPr>
-        <w:pStyle w:val="ListBullet"/>
-      </w:pPr>
-      <w:r>
-        <w:t>A compromised device can directly harm patients (wrong diagnosis, wrong therapy)</w:t>
-      </w:r>
-    </w:p>
-    <w:p>
-      <w:pPr>
-        <w:pStyle w:val="ListBullet"/>
-      </w:pPr>
-      <w:r>
-        <w:t>Medical records are among the most valuable data on the black market</w:t>
-      </w:r>
-    </w:p>
-    <w:p>
-      <w:pPr>
-        <w:pStyle w:val="ListBullet"/>
-      </w:pPr>
-      <w:r>
-        <w:t>Ransomware attacks on hospitals have demonstrably delayed care and caused patient harm</w:t>
-      </w:r>
-    </w:p>
-    <w:p>
-      <w:pPr>
-        <w:pStyle w:val="ListBullet"/>
-      </w:pPr>
-      <w:r>
-        <w:t>Regulatory bodies (FDA, EU MDR) now require cybersecurity documentation as part of premarket submissions</w:t>
-      </w:r>
-    </w:p>
-    <w:p>
-      <w:r>
-        <w:rPr>
-          <w:b/>
-        </w:rPr>
-        <w:t>Real-world context:</w:t>
-      </w:r>
-    </w:p>
-    <w:p>
-      <w:pPr>
-        <w:pStyle w:val="ListBullet"/>
-      </w:pPr>
-      <w:r>
-        <w:t>The FDA's 2023 guidance on cybersecurity in medical devices requires manufacturers to submit a threat model as part of the 510(k) / PMA process</w:t>
-      </w:r>
-    </w:p>
-    <w:p>
-      <w:pPr>
-        <w:pStyle w:val="ListBullet"/>
-      </w:pPr>
-      <w:r>
-        <w:t>MITRE's Playbook (2021) provides a structured framework specifically for medical devices</w:t>
-      </w:r>
-    </w:p>
-    <w:p>
-      <w:pPr>
-        <w:pStyle w:val="ListBullet"/>
-      </w:pPr>
-      <w:r>
-        <w:t>ICS-CERT and CISA regularly publish advisories on vulnerabilities in medical device software</w:t>
-      </w:r>
-    </w:p>
-    <w:p>
-      <w:pPr>
-        <w:pStyle w:val="Heading2"/>
-      </w:pPr>
-      <w:r>
-        <w:t>The MITRE Medical Device Threat Modeling Playbook</w:t>
-      </w:r>
-    </w:p>
-    <w:p>
-      <w:r>
-        <w:t>This workshop is based on the MITRE Playbook for Threat Modeling Medical Devices. The playbook is structured around four questions:</w:t>
-      </w:r>
-    </w:p>
-    <w:tbl>
-      <w:tblPr>
-        <w:tblStyle w:val="TableGrid"/>
-        <w:tblW w:type="auto" w:w="0"/>
-        <w:tblLook w:firstColumn="1" w:firstRow="1" w:lastColumn="0" w:lastRow="0" w:noHBand="0" w:noVBand="1" w:val="04A0"/>
-      </w:tblPr>
-      <w:tblGrid>
-        <w:gridCol w:w="4320"/>
-        <w:gridCol w:w="4320"/>
-      </w:tblGrid>
-      <w:tr>
-        <w:tc>
-          <w:tcPr>
-            <w:tcW w:type="dxa" w:w="4320"/>
-            <w:shd w:val="clear" w:color="auto" w:fill="1F497D"/>
-          </w:tcPr>
-          <w:p>
-            <w:r/>
-            <w:r>
-              <w:rPr>
-                <w:b/>
-                <w:color w:val="FFFFFF"/>
-                <w:sz w:val="20"/>
-              </w:rPr>
-              <w:t>Question</w:t>
-            </w:r>
-          </w:p>
-        </w:tc>
-        <w:tc>
-          <w:tcPr>
-            <w:tcW w:type="dxa" w:w="4320"/>
-            <w:shd w:val="clear" w:color="auto" w:fill="1F497D"/>
-          </w:tcPr>
-          <w:p>
-            <w:r/>
-            <w:r>
-              <w:rPr>
-                <w:b/>
-                <w:color w:val="FFFFFF"/>
-                <w:sz w:val="20"/>
-              </w:rPr>
-              <w:t>Activity</w:t>
-            </w:r>
-          </w:p>
-        </w:tc>
-      </w:tr>
-      <w:tr>
-        <w:tc>
-          <w:tcPr>
-            <w:tcW w:type="dxa" w:w="4320"/>
-          </w:tcPr>
-          <w:p>
-            <w:r/>
-            <w:r>
-              <w:rPr>
-                <w:sz w:val="20"/>
-              </w:rPr>
-              <w:t>Q1</w:t>
-            </w:r>
-          </w:p>
-        </w:tc>
-        <w:tc>
-          <w:tcPr>
-            <w:tcW w:type="dxa" w:w="4320"/>
-          </w:tcPr>
-          <w:p>
-            <w:r/>
-            <w:r>
-              <w:rPr>
-                <w:sz w:val="20"/>
-              </w:rPr>
-              <w:t>What are we working on? — scope the system, identify assets, entry points, and actors</w:t>
-            </w:r>
-          </w:p>
-        </w:tc>
-      </w:tr>
-      <w:tr>
-        <w:tc>
-          <w:tcPr>
-            <w:tcW w:type="dxa" w:w="4320"/>
-          </w:tcPr>
-          <w:p>
-            <w:r/>
-            <w:r>
-              <w:rPr>
-                <w:sz w:val="20"/>
-              </w:rPr>
-              <w:t>Q2</w:t>
-            </w:r>
-          </w:p>
-        </w:tc>
-        <w:tc>
-          <w:tcPr>
-            <w:tcW w:type="dxa" w:w="4320"/>
-          </w:tcPr>
-          <w:p>
-            <w:r/>
-            <w:r>
-              <w:rPr>
-                <w:sz w:val="20"/>
-              </w:rPr>
-              <w:t>What can go wrong? — identify threats (STRIDE, ATT&amp;CK) and assess their risk</w:t>
-            </w:r>
-          </w:p>
-        </w:tc>
-      </w:tr>
-      <w:tr>
-        <w:tc>
-          <w:tcPr>
-            <w:tcW w:type="dxa" w:w="4320"/>
-          </w:tcPr>
-          <w:p>
-            <w:r/>
-            <w:r>
-              <w:rPr>
-                <w:sz w:val="20"/>
-              </w:rPr>
-              <w:t>Q3</w:t>
-            </w:r>
-          </w:p>
-        </w:tc>
-        <w:tc>
-          <w:tcPr>
-            <w:tcW w:type="dxa" w:w="4320"/>
-          </w:tcPr>
-          <w:p>
-            <w:r/>
-            <w:r>
-              <w:rPr>
-                <w:sz w:val="20"/>
-              </w:rPr>
-              <w:t>What are we going to do about it? — define mitigations and controls</w:t>
-            </w:r>
-          </w:p>
-        </w:tc>
-      </w:tr>
-      <w:tr>
-        <w:tc>
-          <w:tcPr>
-            <w:tcW w:type="dxa" w:w="4320"/>
-          </w:tcPr>
-          <w:p>
-            <w:r/>
-            <w:r>
-              <w:rPr>
-                <w:sz w:val="20"/>
-              </w:rPr>
-              <w:t>Q4</w:t>
-            </w:r>
-          </w:p>
-        </w:tc>
-        <w:tc>
-          <w:tcPr>
-            <w:tcW w:type="dxa" w:w="4320"/>
-          </w:tcPr>
-          <w:p>
-            <w:r/>
-            <w:r>
-              <w:rPr>
-                <w:sz w:val="20"/>
-              </w:rPr>
-              <w:t>Did we do a good job? — validate completeness, document, and review</w:t>
-            </w:r>
-          </w:p>
-        </w:tc>
-      </w:tr>
-    </w:tbl>
-    <w:p/>
-    <w:p>
-      <w:pPr>
-        <w:pStyle w:val="Heading2"/>
-      </w:pPr>
-      <w:r>
-        <w:t>What makes medical device threat modeling different?</w:t>
-      </w:r>
-    </w:p>
-    <w:tbl>
-      <w:tblPr>
-        <w:tblStyle w:val="TableGrid"/>
-        <w:tblW w:type="auto" w:w="0"/>
-        <w:tblLook w:firstColumn="1" w:firstRow="1" w:lastColumn="0" w:lastRow="0" w:noHBand="0" w:noVBand="1" w:val="04A0"/>
-      </w:tblPr>
-      <w:tblGrid>
-        <w:gridCol w:w="2880"/>
-        <w:gridCol w:w="2880"/>
-        <w:gridCol w:w="2880"/>
-      </w:tblGrid>
-      <w:tr>
-        <w:tc>
-          <w:tcPr>
-            <w:tcW w:type="dxa" w:w="2880"/>
-            <w:shd w:val="clear" w:color="auto" w:fill="1F497D"/>
-          </w:tcPr>
-          <w:p>
-            <w:r/>
-            <w:r>
-              <w:rPr>
-                <w:b/>
-                <w:color w:val="FFFFFF"/>
-                <w:sz w:val="20"/>
-              </w:rPr>
-              <w:t>Aspect</w:t>
-            </w:r>
-          </w:p>
-        </w:tc>
-        <w:tc>
-          <w:tcPr>
-            <w:tcW w:type="dxa" w:w="2880"/>
-            <w:shd w:val="clear" w:color="auto" w:fill="1F497D"/>
-          </w:tcPr>
-          <w:p>
-            <w:r/>
-            <w:r>
-              <w:rPr>
-                <w:b/>
-                <w:color w:val="FFFFFF"/>
-                <w:sz w:val="20"/>
-              </w:rPr>
-              <w:t>General IT</w:t>
-            </w:r>
-          </w:p>
-        </w:tc>
-        <w:tc>
-          <w:tcPr>
-            <w:tcW w:type="dxa" w:w="2880"/>
-            <w:shd w:val="clear" w:color="auto" w:fill="1F497D"/>
-          </w:tcPr>
-          <w:p>
-            <w:r/>
-            <w:r>
-              <w:rPr>
-                <w:b/>
-                <w:color w:val="FFFFFF"/>
-                <w:sz w:val="20"/>
-              </w:rPr>
-              <w:t>Medical Devices</w:t>
-            </w:r>
-          </w:p>
-        </w:tc>
-      </w:tr>
-      <w:tr>
-        <w:tc>
-          <w:tcPr>
-            <w:tcW w:type="dxa" w:w="2880"/>
-          </w:tcPr>
-          <w:p>
-            <w:r/>
-            <w:r>
-              <w:rPr>
-                <w:sz w:val="20"/>
-              </w:rPr>
-              <w:t>Primary risk</w:t>
-            </w:r>
-          </w:p>
-        </w:tc>
-        <w:tc>
-          <w:tcPr>
-            <w:tcW w:type="dxa" w:w="2880"/>
-          </w:tcPr>
-          <w:p>
-            <w:r/>
-            <w:r>
-              <w:rPr>
-                <w:sz w:val="20"/>
-              </w:rPr>
-              <w:t>Data breach, service disruption</w:t>
-            </w:r>
-          </w:p>
-        </w:tc>
-        <w:tc>
-          <w:tcPr>
-            <w:tcW w:type="dxa" w:w="2880"/>
-          </w:tcPr>
-          <w:p>
-            <w:r/>
-            <w:r>
-              <w:rPr>
-                <w:sz w:val="20"/>
-              </w:rPr>
-              <w:t>Patient harm, misdiagnosis</w:t>
-            </w:r>
-          </w:p>
-        </w:tc>
-      </w:tr>
-      <w:tr>
-        <w:tc>
-          <w:tcPr>
-            <w:tcW w:type="dxa" w:w="2880"/>
-          </w:tcPr>
-          <w:p>
-            <w:r/>
-            <w:r>
-              <w:rPr>
-                <w:sz w:val="20"/>
-              </w:rPr>
-              <w:t>Availability</w:t>
-            </w:r>
-          </w:p>
-        </w:tc>
-        <w:tc>
-          <w:tcPr>
-            <w:tcW w:type="dxa" w:w="2880"/>
-          </w:tcPr>
-          <w:p>
-            <w:r/>
-            <w:r>
-              <w:rPr>
-                <w:sz w:val="20"/>
-              </w:rPr>
-              <w:t>Important</w:t>
-            </w:r>
-          </w:p>
-        </w:tc>
-        <w:tc>
-          <w:tcPr>
-            <w:tcW w:type="dxa" w:w="2880"/>
-          </w:tcPr>
-          <w:p>
-            <w:r/>
-            <w:r>
-              <w:rPr>
-                <w:sz w:val="20"/>
-              </w:rPr>
-              <w:t>Often life-critical</w:t>
-            </w:r>
-          </w:p>
-        </w:tc>
-      </w:tr>
-      <w:tr>
-        <w:tc>
-          <w:tcPr>
-            <w:tcW w:type="dxa" w:w="2880"/>
-          </w:tcPr>
-          <w:p>
-            <w:r/>
-            <w:r>
-              <w:rPr>
-                <w:sz w:val="20"/>
-              </w:rPr>
-              <w:t>Patching cadence</w:t>
-            </w:r>
-          </w:p>
-        </w:tc>
-        <w:tc>
-          <w:tcPr>
-            <w:tcW w:type="dxa" w:w="2880"/>
-          </w:tcPr>
-          <w:p>
-            <w:r/>
-            <w:r>
-              <w:rPr>
-                <w:sz w:val="20"/>
-              </w:rPr>
-              <w:t>Weekly/monthly</w:t>
-            </w:r>
-          </w:p>
-        </w:tc>
-        <w:tc>
-          <w:tcPr>
-            <w:tcW w:type="dxa" w:w="2880"/>
-          </w:tcPr>
-          <w:p>
-            <w:r/>
-            <w:r>
-              <w:rPr>
-                <w:sz w:val="20"/>
-              </w:rPr>
-              <w:t>12–18 months (FDA clearance required)</w:t>
-            </w:r>
-          </w:p>
-        </w:tc>
-      </w:tr>
-      <w:tr>
-        <w:tc>
-          <w:tcPr>
-            <w:tcW w:type="dxa" w:w="2880"/>
-          </w:tcPr>
-          <w:p>
-            <w:r/>
-            <w:r>
-              <w:rPr>
-                <w:sz w:val="20"/>
-              </w:rPr>
-              <w:t>Regulatory context</w:t>
-            </w:r>
-          </w:p>
-        </w:tc>
-        <w:tc>
-          <w:tcPr>
-            <w:tcW w:type="dxa" w:w="2880"/>
-          </w:tcPr>
-          <w:p>
-            <w:r/>
-            <w:r>
-              <w:rPr>
-                <w:sz w:val="20"/>
-              </w:rPr>
-              <w:t>GDPR, CCPA</w:t>
-            </w:r>
-          </w:p>
-        </w:tc>
-        <w:tc>
-          <w:tcPr>
-            <w:tcW w:type="dxa" w:w="2880"/>
-          </w:tcPr>
-          <w:p>
-            <w:r/>
-            <w:r>
-              <w:rPr>
-                <w:sz w:val="20"/>
-              </w:rPr>
-              <w:t>FDA, EU MDR, IEC 62443, IEC 81001-5-1</w:t>
-            </w:r>
-          </w:p>
-        </w:tc>
-      </w:tr>
-      <w:tr>
-        <w:tc>
-          <w:tcPr>
-            <w:tcW w:type="dxa" w:w="2880"/>
-          </w:tcPr>
-          <w:p>
-            <w:r/>
-            <w:r>
-              <w:rPr>
-                <w:sz w:val="20"/>
-              </w:rPr>
-              <w:t>Threat actors</w:t>
-            </w:r>
-          </w:p>
-        </w:tc>
-        <w:tc>
-          <w:tcPr>
-            <w:tcW w:type="dxa" w:w="2880"/>
-          </w:tcPr>
-          <w:p>
-            <w:r/>
-            <w:r>
-              <w:rPr>
-                <w:sz w:val="20"/>
-              </w:rPr>
-              <w:t>Opportunistic attackers</w:t>
-            </w:r>
-          </w:p>
-        </w:tc>
-        <w:tc>
-          <w:tcPr>
-            <w:tcW w:type="dxa" w:w="2880"/>
-          </w:tcPr>
-          <w:p>
-            <w:r/>
-            <w:r>
-              <w:rPr>
-                <w:sz w:val="20"/>
-              </w:rPr>
-              <w:t>Includes nation-states targeting healthcare</w:t>
-            </w:r>
-          </w:p>
-        </w:tc>
-      </w:tr>
-      <w:tr>
-        <w:tc>
-          <w:tcPr>
-            <w:tcW w:type="dxa" w:w="2880"/>
-          </w:tcPr>
-          <w:p>
-            <w:r/>
-            <w:r>
-              <w:rPr>
-                <w:sz w:val="20"/>
-              </w:rPr>
-              <w:t>Supply chain</w:t>
-            </w:r>
-          </w:p>
-        </w:tc>
-        <w:tc>
-          <w:tcPr>
-            <w:tcW w:type="dxa" w:w="2880"/>
-          </w:tcPr>
-          <w:p>
-            <w:r/>
-            <w:r>
-              <w:rPr>
-                <w:sz w:val="20"/>
-              </w:rPr>
-              <w:t>Standard IT</w:t>
-            </w:r>
-          </w:p>
-        </w:tc>
-        <w:tc>
-          <w:tcPr>
-            <w:tcW w:type="dxa" w:w="2880"/>
-          </w:tcPr>
-          <w:p>
-            <w:r/>
-            <w:r>
-              <w:rPr>
-                <w:sz w:val="20"/>
-              </w:rPr>
-              <w:t>Proprietary protocols, COTS components in regulated systems</w:t>
-            </w:r>
-          </w:p>
-        </w:tc>
-      </w:tr>
-    </w:tbl>
-    <w:p/>
-    <w:p>
-      <w:pPr>
-        <w:pStyle w:val="Heading2"/>
-      </w:pPr>
-      <w:r>
-        <w:t>Today's scenario</w:t>
-      </w:r>
-    </w:p>
-    <w:p>
-      <w:r>
-        <w:t>You will threat model the NeuroScan 3000 — a hybrid MRI-based neurological imaging system. The next section (Product &amp; Architecture) describes it. Read it before you start Q1, then fill in the Threat Model Worksheet section by section as you work through Q1–Q4.</w:t>
-      </w:r>
-    </w:p>
-    <w:p>
-      <w:r>
-        <w:br w:type="page"/>
-      </w:r>
-    </w:p>
     <w:p>
       <w:pPr>
         <w:pStyle w:val="Heading1"/>
@@ -1501,78 +821,46 @@
           <w:color w:val="555555"/>
           <w:sz w:val="20"/>
         </w:rPr>
-        <w:t>Monospaced ASCII diagram — best viewed in a fixed-width font.</w:t>
+        <w:t>Boxes = components, dashed frames = trust zones, arrows = data flows.</w:t>
       </w:r>
     </w:p>
     <w:p>
+      <w:pPr>
+        <w:jc w:val="center"/>
+      </w:pPr>
       <w:r>
-        <w:rPr>
-          <w:rFonts w:ascii="Consolas" w:hAnsi="Consolas"/>
-          <w:sz w:val="14"/>
-        </w:rPr>
-        <w:t>┌──────────────────────────────────────────────────────────────────┐</w:t>
-        <w:br/>
-        <w:t>│  HOSPITAL NETWORK                                                  │</w:t>
-        <w:br/>
-        <w:t>│                                                                    │</w:t>
-        <w:br/>
-        <w:t>│  ┌──────────────┐    USB /      ┌────────────────────────────┐     │</w:t>
-        <w:br/>
-        <w:t>│  │  Imaging     │  Proprietary  │  Acquisition Workstation    │     │</w:t>
-        <w:br/>
-        <w:t>│  │  Unit        │◄─────────────►│  (Windows 10)               │     │</w:t>
-        <w:br/>
-        <w:t>│  │  (RTOS)      │   Protocol    │  Scanning software          │     │</w:t>
-        <w:br/>
-        <w:t>│  │              │               │  Admin console (:8443)      │     │</w:t>
-        <w:br/>
-        <w:t>│  └──────────────┘               └──────────┬─────────────────┘     │</w:t>
-        <w:br/>
-        <w:t>│                                        Hospital LAN                 │</w:t>
-        <w:br/>
-        <w:t>│                               ┌────────────▼───────────┐           │</w:t>
-        <w:br/>
-        <w:t>│                               │  Local DICOM Server     │           │</w:t>
-        <w:br/>
-        <w:t>│                               │  (stores scan images)   │           │</w:t>
-        <w:br/>
-        <w:t>│                               └────────────────────────┘           │</w:t>
-        <w:br/>
-        <w:t>└──────────────────────────┬────────────────────────────────────────┘</w:t>
-        <w:br/>
-        <w:t xml:space="preserve">                           │ Internet (TLS 1.3, mutual TLS)</w:t>
-        <w:br/>
-        <w:t>┌──────────────────────────▼────────────────────────────────────────┐</w:t>
-        <w:br/>
-        <w:t>│  MEDISCANTECH CLOUD                                                 │</w:t>
-        <w:br/>
-        <w:t>│  ┌──────────────────┐   ┌──────────────────┐                       │</w:t>
-        <w:br/>
-        <w:t>│  │  AI Inference    │◄──│  Cloud Storage   │                       │</w:t>
-        <w:br/>
-        <w:t>│  │  Service (REST)  │   │  (anon. images)  │                       │</w:t>
-        <w:br/>
-        <w:t>│  └──────────────────┘   └──────────────────┘                       │</w:t>
-        <w:br/>
-        <w:t>│  ┌──────────────────────────────────────────────────────────────┐ │</w:t>
-        <w:br/>
-        <w:t>│  │  Manufacturer Backend (training, monitoring, support)         │ │</w:t>
-        <w:br/>
-        <w:t>│  └──────────────────────────────────────────────────────────────┘ │</w:t>
-        <w:br/>
-        <w:t>│  ┌──────────────────────────────────────────────────────────────┐ │</w:t>
-        <w:br/>
-        <w:t>│  │  Update Delivery Service                                      │ │</w:t>
-        <w:br/>
-        <w:t>│  └──────────────────────────────┬───────────────────────────────┘ │</w:t>
-        <w:br/>
-        <w:t>└─────────────────────────────────┼──────────────────────────────────┘</w:t>
-        <w:br/>
-        <w:t xml:space="preserve">                                  │ Updates (TLS, signed packages)</w:t>
-        <w:br/>
-        <w:t xml:space="preserve">                                  ▼</w:t>
-        <w:br/>
-        <w:t xml:space="preserve">                     [Workstation + Imaging Unit firmware]</w:t>
+        <w:drawing>
+          <wp:inline xmlns:a="http://schemas.openxmlformats.org/drawingml/2006/main" xmlns:pic="http://schemas.openxmlformats.org/drawingml/2006/picture">
+            <wp:extent cx="5760720" cy="4489038"/>
+            <wp:docPr id="1" name="Picture 1"/>
+            <wp:cNvGraphicFramePr>
+              <a:graphicFrameLocks noChangeAspect="1"/>
+            </wp:cNvGraphicFramePr>
+            <a:graphic>
+              <a:graphicData uri="http://schemas.openxmlformats.org/drawingml/2006/picture">
+                <pic:pic>
+                  <pic:nvPicPr>
+                    <pic:cNvPr id="0" name="neuroscan_architecture.png"/>
+                    <pic:cNvPicPr/>
+                  </pic:nvPicPr>
+                  <pic:blipFill>
+                    <a:blip r:embed="rId9"/>
+                    <a:stretch>
+                      <a:fillRect/>
+                    </a:stretch>
+                  </pic:blipFill>
+                  <pic:spPr>
+                    <a:xfrm>
+                      <a:off x="0" y="0"/>
+                      <a:ext cx="5760720" cy="4489038"/>
+                    </a:xfrm>
+                    <a:prstGeom prst="rect"/>
+                  </pic:spPr>
+                </pic:pic>
+              </a:graphicData>
+            </a:graphic>
+          </wp:inline>
+        </w:drawing>
       </w:r>
     </w:p>
     <w:p>

</xml_diff>

<commit_message>
Regenerate participant template with the Hospital EMR
Bring the generated worksheet's Product & Architecture section in line with the
updated scenario: the architecture diagram now shows the hospital EMR as a
dashed (external / partially-trusted) box connected to the workstation over HL7
FHIR, and the trust-boundary (TB-6), data-flow, interface, and security-
assumption content match scenario/system-architecture.md and device-overview.md.

Regenerates templates/threat-model-template.docx from the updated generator.

Co-authored-by: Ona <no-reply@ona.com>
</commit_message>
<xml_diff>
--- a/templates/threat-model-template.docx
+++ b/templates/threat-model-template.docx
@@ -808,6 +808,14 @@
     </w:p>
     <w:p>
       <w:pPr>
+        <w:pStyle w:val="ListBullet"/>
+      </w:pPr>
+      <w:r>
+        <w:t>The workstation integrates with the hospital EMR, which MediScanTech does not own or secure — treat it as a partially-trusted external dependency and do not assume data received from it is safe</w:t>
+      </w:r>
+    </w:p>
+    <w:p>
+      <w:pPr>
         <w:pStyle w:val="Heading2"/>
       </w:pPr>
       <w:r>
@@ -1155,6 +1163,50 @@
           </w:p>
         </w:tc>
       </w:tr>
+      <w:tr>
+        <w:tc>
+          <w:tcPr>
+            <w:tcW w:type="dxa" w:w="2880"/>
+          </w:tcPr>
+          <w:p>
+            <w:r/>
+            <w:r>
+              <w:rPr>
+                <w:sz w:val="20"/>
+              </w:rPr>
+              <w:t>TB-6</w:t>
+            </w:r>
+          </w:p>
+        </w:tc>
+        <w:tc>
+          <w:tcPr>
+            <w:tcW w:type="dxa" w:w="2880"/>
+          </w:tcPr>
+          <w:p>
+            <w:r/>
+            <w:r>
+              <w:rPr>
+                <w:sz w:val="20"/>
+              </w:rPr>
+              <w:t>Acquisition workstation ↔ Hospital EMR</w:t>
+            </w:r>
+          </w:p>
+        </w:tc>
+        <w:tc>
+          <w:tcPr>
+            <w:tcW w:type="dxa" w:w="2880"/>
+          </w:tcPr>
+          <w:p>
+            <w:r/>
+            <w:r>
+              <w:rPr>
+                <w:sz w:val="20"/>
+              </w:rPr>
+              <w:t>External system, hospital-owned — separate security governance; treat as partially-trusted</w:t>
+            </w:r>
+          </w:p>
+        </w:tc>
+      </w:tr>
     </w:tbl>
     <w:p/>
     <w:p>
@@ -1489,6 +1541,50 @@
                 <w:sz w:val="20"/>
               </w:rPr>
               <w:t>Local admin console, remote support</w:t>
+            </w:r>
+          </w:p>
+        </w:tc>
+      </w:tr>
+      <w:tr>
+        <w:tc>
+          <w:tcPr>
+            <w:tcW w:type="dxa" w:w="2880"/>
+          </w:tcPr>
+          <w:p>
+            <w:r/>
+            <w:r>
+              <w:rPr>
+                <w:sz w:val="20"/>
+              </w:rPr>
+              <w:t>Diagnostic reports / patient &amp; order data</w:t>
+            </w:r>
+          </w:p>
+        </w:tc>
+        <w:tc>
+          <w:tcPr>
+            <w:tcW w:type="dxa" w:w="2880"/>
+          </w:tcPr>
+          <w:p>
+            <w:r/>
+            <w:r>
+              <w:rPr>
+                <w:sz w:val="20"/>
+              </w:rPr>
+              <w:t>High</w:t>
+            </w:r>
+          </w:p>
+        </w:tc>
+        <w:tc>
+          <w:tcPr>
+            <w:tcW w:type="dxa" w:w="2880"/>
+          </w:tcPr>
+          <w:p>
+            <w:r/>
+            <w:r>
+              <w:rPr>
+                <w:sz w:val="20"/>
+              </w:rPr>
+              <w:t>Workstation ↔ Hospital EMR (HL7 FHIR)</w:t>
             </w:r>
           </w:p>
         </w:tc>
@@ -1927,6 +2023,64 @@
               <w:rPr>
                 <w:sz w:val="20"/>
               </w:rPr>
+            </w:r>
+          </w:p>
+        </w:tc>
+      </w:tr>
+      <w:tr>
+        <w:tc>
+          <w:tcPr>
+            <w:tcW w:type="dxa" w:w="2160"/>
+          </w:tcPr>
+          <w:p>
+            <w:r/>
+            <w:r>
+              <w:rPr>
+                <w:sz w:val="20"/>
+              </w:rPr>
+              <w:t>Workstation → Hospital EMR</w:t>
+            </w:r>
+          </w:p>
+        </w:tc>
+        <w:tc>
+          <w:tcPr>
+            <w:tcW w:type="dxa" w:w="2160"/>
+          </w:tcPr>
+          <w:p>
+            <w:r/>
+            <w:r>
+              <w:rPr>
+                <w:sz w:val="20"/>
+              </w:rPr>
+              <w:t>HL7 FHIR over HTTPS</w:t>
+            </w:r>
+          </w:p>
+        </w:tc>
+        <w:tc>
+          <w:tcPr>
+            <w:tcW w:type="dxa" w:w="2160"/>
+          </w:tcPr>
+          <w:p>
+            <w:r/>
+            <w:r>
+              <w:rPr>
+                <w:sz w:val="20"/>
+              </w:rPr>
+              <w:t>OAuth 2.0</w:t>
+            </w:r>
+          </w:p>
+        </w:tc>
+        <w:tc>
+          <w:tcPr>
+            <w:tcW w:type="dxa" w:w="2160"/>
+          </w:tcPr>
+          <w:p>
+            <w:r/>
+            <w:r>
+              <w:rPr>
+                <w:sz w:val="20"/>
+              </w:rPr>
+              <w:t>External hospital-owned system; treat as partially-trusted</w:t>
             </w:r>
           </w:p>
         </w:tc>

</xml_diff>